<commit_message>
Eliminar archivos obsoletos y agregar documentación del proyecto y justificación del modelo predictivo
</commit_message>
<xml_diff>
--- a/informe/INFORME_TECNICO_SAFEANALYTICS_EC.docx
+++ b/informe/INFORME_TECNICO_SAFEANALYTICS_EC.docx
@@ -159,7 +159,27 @@
           <w:sz w:val="26"/>
           <w:szCs w:val="26"/>
         </w:rPr>
-        <w:t>«SafeAnalytics EC»</w:t>
+        <w:t>«</w:t>
+      </w:r>
+      <w:proofErr w:type="spellStart"/>
+      <w:r>
+        <w:rPr>
+          <w:b/>
+          <w:bCs/>
+          <w:sz w:val="26"/>
+          <w:szCs w:val="26"/>
+        </w:rPr>
+        <w:t>SafeAnalytics</w:t>
+      </w:r>
+      <w:proofErr w:type="spellEnd"/>
+      <w:r>
+        <w:rPr>
+          <w:b/>
+          <w:bCs/>
+          <w:sz w:val="26"/>
+          <w:szCs w:val="26"/>
+        </w:rPr>
+        <w:t xml:space="preserve"> EC»</w:t>
       </w:r>
     </w:p>
     <w:p>
@@ -311,6 +331,7 @@
           <w:sz w:val="28"/>
           <w:szCs w:val="28"/>
         </w:rPr>
+        <w:lastRenderedPageBreak/>
         <w:t>CONTENIDO</w:t>
       </w:r>
     </w:p>
@@ -319,7 +340,6 @@
         <w:alias w:val="Tabla de contenido"/>
         <w:id w:val="2135370463"/>
       </w:sdtPr>
-      <w:sdtEndPr/>
       <w:sdtContent>
         <w:p>
           <w:pPr>
@@ -4776,6 +4796,7 @@
       </w:pPr>
       <w:bookmarkStart w:id="0" w:name="_Toc234523474"/>
       <w:r>
+        <w:lastRenderedPageBreak/>
         <w:t>Fase 1: Definición del Negocio y Entendimiento del Problema</w:t>
       </w:r>
       <w:bookmarkEnd w:id="0"/>
@@ -4797,8 +4818,13 @@
         <w:spacing w:after="160" w:line="276" w:lineRule="auto"/>
         <w:jc w:val="both"/>
       </w:pPr>
-      <w:r>
-        <w:t>SafeAnalytics EC es una solución analítica orientada al monitoreo estratégico de homicidios intencionales en Ecuador. El proyecto se enfoca en el ámbito de la seguridad ciudadana y está dirigido a instituciones, autoridades, unidades de análisis criminal, responsables de planificación operativa y tomadores de decisiones que necesitan interpretar grandes volúmenes de información delictiva de forma rápida, clara y confiable.</w:t>
+      <w:proofErr w:type="spellStart"/>
+      <w:r>
+        <w:t>SafeAnalytics</w:t>
+      </w:r>
+      <w:proofErr w:type="spellEnd"/>
+      <w:r>
+        <w:t xml:space="preserve"> EC es una solución analítica orientada al monitoreo estratégico de homicidios intencionales en Ecuador. El proyecto se enfoca en el ámbito de la seguridad ciudadana y está dirigido a instituciones, autoridades, unidades de análisis criminal, responsables de planificación operativa y tomadores de decisiones que necesitan interpretar grandes volúmenes de información delictiva de forma rápida, clara y confiable.</w:t>
       </w:r>
     </w:p>
     <w:p>
@@ -4816,7 +4842,15 @@
         <w:jc w:val="both"/>
       </w:pPr>
       <w:r>
-        <w:t>En este contexto, SafeAnalytics EC busca transformar datos operativos sobre homicidios intencionales en inteligencia ejecutiva para apoyar la prevención del delito, la asignación de recursos y el seguimiento de indicadores de seguridad.</w:t>
+        <w:t xml:space="preserve">En este contexto, </w:t>
+      </w:r>
+      <w:proofErr w:type="spellStart"/>
+      <w:r>
+        <w:t>SafeAnalytics</w:t>
+      </w:r>
+      <w:proofErr w:type="spellEnd"/>
+      <w:r>
+        <w:t xml:space="preserve"> EC busca transformar datos operativos sobre homicidios intencionales en inteligencia ejecutiva para apoyar la prevención del delito, la asignación de recursos y el seguimiento de indicadores de seguridad.</w:t>
       </w:r>
     </w:p>
     <w:p>
@@ -4827,7 +4861,15 @@
       </w:pPr>
       <w:bookmarkStart w:id="2" w:name="_Toc234523476"/>
       <w:r>
-        <w:t>1.2. Planteamiento del Problema (Cultura Data-Driven)</w:t>
+        <w:t>1.2. Planteamiento del Problema (Cultura Data-</w:t>
+      </w:r>
+      <w:proofErr w:type="spellStart"/>
+      <w:r>
+        <w:t>Driven</w:t>
+      </w:r>
+      <w:proofErr w:type="spellEnd"/>
+      <w:r>
+        <w:t>)</w:t>
       </w:r>
       <w:bookmarkEnd w:id="2"/>
     </w:p>
@@ -4948,7 +4990,15 @@
         <w:jc w:val="both"/>
       </w:pPr>
       <w:r>
-        <w:t>Ante esta problemática, surge la necesidad de desarrollar un dashboard ejecutivo que consolide la información en una única plataforma analítica, permitiendo visualizar indicadores, detectar patrones geográficos y temporales, y generar recomendaciones para apoyar la toma de decisiones basada en datos.</w:t>
+        <w:t xml:space="preserve">Ante esta problemática, surge la necesidad de desarrollar un </w:t>
+      </w:r>
+      <w:proofErr w:type="spellStart"/>
+      <w:r>
+        <w:t>dashboard</w:t>
+      </w:r>
+      <w:proofErr w:type="spellEnd"/>
+      <w:r>
+        <w:t xml:space="preserve"> ejecutivo que consolide la información en una única plataforma analítica, permitiendo visualizar indicadores, detectar patrones geográficos y temporales, y generar recomendaciones para apoyar la toma de decisiones basada en datos.</w:t>
       </w:r>
     </w:p>
     <w:p>
@@ -4959,6 +5009,7 @@
       </w:pPr>
       <w:bookmarkStart w:id="3" w:name="_Toc234523477"/>
       <w:r>
+        <w:lastRenderedPageBreak/>
         <w:t>1.3. Objetivos de Analítica</w:t>
       </w:r>
       <w:bookmarkEnd w:id="3"/>
@@ -4981,7 +5032,15 @@
         <w:jc w:val="both"/>
       </w:pPr>
       <w:r>
-        <w:t>Diseñar e implementar un dashboard ejecutivo interactivo que permita visualizar y analizar los principales indicadores relacionados con homicidios intencionales registrados en Ecuador, facilitando el monitoreo de la incidencia delictiva, la identificación de patrones geográficos y temporales, y el apoyo a la toma de decisiones estratégicas en materia de seguridad ciudadana.</w:t>
+        <w:t xml:space="preserve">Diseñar e implementar un </w:t>
+      </w:r>
+      <w:proofErr w:type="spellStart"/>
+      <w:r>
+        <w:t>dashboard</w:t>
+      </w:r>
+      <w:proofErr w:type="spellEnd"/>
+      <w:r>
+        <w:t xml:space="preserve"> ejecutivo interactivo que permita visualizar y analizar los principales indicadores relacionados con homicidios intencionales registrados en Ecuador, facilitando el monitoreo de la incidencia delictiva, la identificación de patrones geográficos y temporales, y el apoyo a la toma de decisiones estratégicas en materia de seguridad ciudadana.</w:t>
       </w:r>
     </w:p>
     <w:p>
@@ -5277,6 +5336,7 @@
       </w:pPr>
       <w:bookmarkStart w:id="8" w:name="_Toc234523482"/>
       <w:r>
+        <w:lastRenderedPageBreak/>
         <w:t>Analítica Prescriptiva</w:t>
       </w:r>
       <w:bookmarkEnd w:id="8"/>
@@ -5515,7 +5575,15 @@
         <w:jc w:val="both"/>
       </w:pPr>
       <w:r>
-        <w:t>El dataset permite construir un modelo analítico multidimensional para estudiar los homicidios intencionales desde perspectivas territoriales, temporales, delictivas y sociodemográficas.</w:t>
+        <w:t xml:space="preserve">El </w:t>
+      </w:r>
+      <w:proofErr w:type="spellStart"/>
+      <w:r>
+        <w:t>dataset</w:t>
+      </w:r>
+      <w:proofErr w:type="spellEnd"/>
+      <w:r>
+        <w:t xml:space="preserve"> permite construir un modelo analítico multidimensional para estudiar los homicidios intencionales desde perspectivas territoriales, temporales, delictivas y sociodemográficas.</w:t>
       </w:r>
     </w:p>
     <w:p>
@@ -5536,7 +5604,23 @@
         <w:jc w:val="both"/>
       </w:pPr>
       <w:r>
-        <w:t>Además del archivo oficial del MDI, el proyecto integra una segunda fuente de datos a través de una API pública, cumpliendo con el requisito de utilizar al menos una interfaz programática de acceso a datos abiertos. La API seleccionada es la del Banco Mundial (World Development Indicators), mediante el indicador SP.POP.TOTL, que entrega la población total de Ecuador en formato JSON, sin necesidad de clave de acceso y con disponibilidad global.</w:t>
+        <w:t xml:space="preserve">Además del archivo oficial del MDI, el proyecto integra una segunda fuente de datos a través de una API pública, cumpliendo con el requisito de utilizar al menos una interfaz programática de acceso a datos abiertos. La API seleccionada es la del Banco Mundial (World </w:t>
+      </w:r>
+      <w:proofErr w:type="spellStart"/>
+      <w:r>
+        <w:t>Development</w:t>
+      </w:r>
+      <w:proofErr w:type="spellEnd"/>
+      <w:r>
+        <w:t xml:space="preserve"> </w:t>
+      </w:r>
+      <w:proofErr w:type="spellStart"/>
+      <w:r>
+        <w:t>Indicators</w:t>
+      </w:r>
+      <w:proofErr w:type="spellEnd"/>
+      <w:r>
+        <w:t>), mediante el indicador SP.POP.TOTL, que entrega la población total de Ecuador en formato JSON, sin necesidad de clave de acceso y con disponibilidad global.</w:t>
       </w:r>
     </w:p>
     <w:p>
@@ -5545,7 +5629,15 @@
         <w:jc w:val="both"/>
       </w:pPr>
       <w:r>
-        <w:t>El endpoint utilizado es:</w:t>
+        <w:t xml:space="preserve">El </w:t>
+      </w:r>
+      <w:proofErr w:type="spellStart"/>
+      <w:r>
+        <w:t>endpoint</w:t>
+      </w:r>
+      <w:proofErr w:type="spellEnd"/>
+      <w:r>
+        <w:t xml:space="preserve"> utilizado es:</w:t>
       </w:r>
     </w:p>
     <w:p>
@@ -5568,10 +5660,11 @@
         <w:jc w:val="both"/>
       </w:pPr>
       <w:r>
-        <w:t xml:space="preserve">La población obtenida por la API se emplea para calcular la tasa de homicidios por cada 100.000 habitantes, un indicador que permite dimensionar la incidencia en términos poblacionales y no solo en volumen absoluto. La integración se implementó en el módulo src/etl/poblacion_api.py con una estrategia resiliente de tres niveles: consulta en vivo a la API, uso de la última respuesta cacheada en disco y, como último recurso, un valor de respaldo documentado, de modo que el análisis y la defensa no dependan de </w:t>
-      </w:r>
-      <w:r>
-        <w:t>la conexión en el momento de la exposición.</w:t>
+        <w:t xml:space="preserve">La población obtenida por la API se emplea para calcular la tasa de homicidios por cada 100.000 habitantes, un indicador que permite dimensionar la incidencia en términos poblacionales y no solo en volumen absoluto. La integración se implementó en el módulo src/etl/poblacion_api.py con una </w:t>
+      </w:r>
+      <w:r>
+        <w:lastRenderedPageBreak/>
+        <w:t>estrategia resiliente de tres niveles: consulta en vivo a la API, uso de la última respuesta cacheada en disco y, como último recurso, un valor de respaldo documentado, de modo que el análisis y la defensa no dependan de la conexión en el momento de la exposición.</w:t>
       </w:r>
     </w:p>
     <w:p>
@@ -5580,10 +5673,15 @@
         <w:jc w:val="both"/>
       </w:pPr>
       <w:r>
-        <w:t>Nota sobre la fuente del MDI: el dataset de homicidios intencionales también se publica en el portal Datos Abiertos Ecuador (CKAN), que expone una API REST estándar. Sin embargo, el servidor del portal restringe el acceso a la ruta /api/ y responde con un error 403 (Prohibido) incluso desde navegadores locales, por lo que no es posible consumirlo programáticamente. Por esta razón se utiliza el archivo oficial descargado como fuente principal y se complementa con la API del Banco Mundial, que sí es de acceso</w:t>
-      </w:r>
-      <w:r>
-        <w:t xml:space="preserve"> público efectivo.</w:t>
+        <w:t xml:space="preserve">Nota sobre la fuente del MDI: el </w:t>
+      </w:r>
+      <w:proofErr w:type="spellStart"/>
+      <w:r>
+        <w:t>dataset</w:t>
+      </w:r>
+      <w:proofErr w:type="spellEnd"/>
+      <w:r>
+        <w:t xml:space="preserve"> de homicidios intencionales también se publica en el portal Datos Abiertos Ecuador (CKAN), que expone una API REST estándar. Sin embargo, el servidor del portal restringe el acceso a la ruta /api/ y responde con un error 403 (Prohibido) incluso desde navegadores locales, por lo que no es posible consumirlo programáticamente. Por esta razón se utiliza el archivo oficial descargado como fuente principal y se complementa con la API del Banco Mundial, que sí es de acceso público efectivo.</w:t>
       </w:r>
     </w:p>
     <w:p>
@@ -5709,7 +5807,15 @@
         <w:jc w:val="both"/>
       </w:pPr>
       <w:r>
-        <w:t>El dashboard debe evitar interpretaciones que criminalicen territorios o grupos humanos. Su propósito es apoyar la planificación institucional, la prevención del delito y la asignación eficiente de recursos, no generar perfiles discriminatorios.</w:t>
+        <w:t xml:space="preserve">El </w:t>
+      </w:r>
+      <w:proofErr w:type="spellStart"/>
+      <w:r>
+        <w:t>dashboard</w:t>
+      </w:r>
+      <w:proofErr w:type="spellEnd"/>
+      <w:r>
+        <w:t xml:space="preserve"> debe evitar interpretaciones que criminalicen territorios o grupos humanos. Su propósito es apoyar la planificación institucional, la prevención del delito y la asignación eficiente de recursos, no generar perfiles discriminatorios.</w:t>
       </w:r>
     </w:p>
     <w:p>
@@ -5751,7 +5857,23 @@
         <w:jc w:val="both"/>
       </w:pPr>
       <w:r>
-        <w:t>Para el proyecto SafeAnalytics EC se diseñó un modelo multidimensional de tipo estrella, debido a que permite organizar la información de homicidios intencionales de manera clara, eficiente y fácil de consumir desde herramientas de inteligencia de negocios como Power BI y Streamlit.</w:t>
+        <w:t xml:space="preserve">Para el proyecto </w:t>
+      </w:r>
+      <w:proofErr w:type="spellStart"/>
+      <w:r>
+        <w:t>SafeAnalytics</w:t>
+      </w:r>
+      <w:proofErr w:type="spellEnd"/>
+      <w:r>
+        <w:t xml:space="preserve"> EC se diseñó un modelo multidimensional de tipo estrella, debido a que permite organizar la información de homicidios intencionales de manera clara, eficiente y fácil de consumir desde herramientas de inteligencia de negocios como Power BI y </w:t>
+      </w:r>
+      <w:proofErr w:type="spellStart"/>
+      <w:r>
+        <w:t>Streamlit</w:t>
+      </w:r>
+      <w:proofErr w:type="spellEnd"/>
+      <w:r>
+        <w:t>.</w:t>
       </w:r>
     </w:p>
     <w:p>
@@ -5760,6 +5882,7 @@
         <w:jc w:val="both"/>
       </w:pPr>
       <w:r>
+        <w:lastRenderedPageBreak/>
         <w:t>El modelo estrella se compone de una tabla central de hechos y varias tablas de dimensiones conectadas directamente a ella. Esta estructura facilita el análisis por tiempo, territorio, características del delito y perfil de la víctima, sin generar una complejidad excesiva para el usuario ejecutivo.</w:t>
       </w:r>
     </w:p>
@@ -5795,7 +5918,15 @@
         <w:jc w:val="both"/>
       </w:pPr>
       <w:r>
-        <w:t>Facilita la construcción de KPIs ejecutivos.</w:t>
+        <w:t xml:space="preserve">Facilita la construcción de </w:t>
+      </w:r>
+      <w:proofErr w:type="spellStart"/>
+      <w:r>
+        <w:t>KPIs</w:t>
+      </w:r>
+      <w:proofErr w:type="spellEnd"/>
+      <w:r>
+        <w:t xml:space="preserve"> ejecutivos.</w:t>
       </w:r>
     </w:p>
     <w:p>
@@ -5851,7 +5982,15 @@
         <w:jc w:val="both"/>
       </w:pPr>
       <w:r>
-        <w:t>Se adapta correctamente a la naturaleza del dataset, donde cada registro representa un evento asociado a tiempo, ubicación, delito y víctima.</w:t>
+        <w:t xml:space="preserve">Se adapta correctamente a la naturaleza del </w:t>
+      </w:r>
+      <w:proofErr w:type="spellStart"/>
+      <w:r>
+        <w:t>dataset</w:t>
+      </w:r>
+      <w:proofErr w:type="spellEnd"/>
+      <w:r>
+        <w:t>, donde cada registro representa un evento asociado a tiempo, ubicación, delito y víctima.</w:t>
       </w:r>
     </w:p>
     <w:p>
@@ -5877,8 +6016,18 @@
           <w:sz w:val="20"/>
           <w:szCs w:val="20"/>
         </w:rPr>
-        <w:t xml:space="preserve">                 dim_tiempo</w:t>
-      </w:r>
+        <w:t xml:space="preserve">                 </w:t>
+      </w:r>
+      <w:proofErr w:type="spellStart"/>
+      <w:r>
+        <w:rPr>
+          <w:rFonts w:ascii="Consolas" w:eastAsia="Consolas" w:hAnsi="Consolas" w:cs="Consolas"/>
+          <w:sz w:val="20"/>
+          <w:szCs w:val="20"/>
+        </w:rPr>
+        <w:t>dim_tiempo</w:t>
+      </w:r>
+      <w:proofErr w:type="spellEnd"/>
       <w:r>
         <w:rPr>
           <w:rFonts w:ascii="Consolas" w:eastAsia="Consolas" w:hAnsi="Consolas" w:cs="Consolas"/>
@@ -5895,8 +6044,54 @@
           <w:szCs w:val="20"/>
         </w:rPr>
         <w:br/>
-        <w:t xml:space="preserve"> dim_geografia -- fact_homicidios -- dim_delito</w:t>
-      </w:r>
+        <w:t xml:space="preserve"> </w:t>
+      </w:r>
+      <w:proofErr w:type="spellStart"/>
+      <w:r>
+        <w:rPr>
+          <w:rFonts w:ascii="Consolas" w:eastAsia="Consolas" w:hAnsi="Consolas" w:cs="Consolas"/>
+          <w:sz w:val="20"/>
+          <w:szCs w:val="20"/>
+        </w:rPr>
+        <w:t>dim_geografia</w:t>
+      </w:r>
+      <w:proofErr w:type="spellEnd"/>
+      <w:r>
+        <w:rPr>
+          <w:rFonts w:ascii="Consolas" w:eastAsia="Consolas" w:hAnsi="Consolas" w:cs="Consolas"/>
+          <w:sz w:val="20"/>
+          <w:szCs w:val="20"/>
+        </w:rPr>
+        <w:t xml:space="preserve"> -- </w:t>
+      </w:r>
+      <w:proofErr w:type="spellStart"/>
+      <w:r>
+        <w:rPr>
+          <w:rFonts w:ascii="Consolas" w:eastAsia="Consolas" w:hAnsi="Consolas" w:cs="Consolas"/>
+          <w:sz w:val="20"/>
+          <w:szCs w:val="20"/>
+        </w:rPr>
+        <w:t>fact_homicidios</w:t>
+      </w:r>
+      <w:proofErr w:type="spellEnd"/>
+      <w:r>
+        <w:rPr>
+          <w:rFonts w:ascii="Consolas" w:eastAsia="Consolas" w:hAnsi="Consolas" w:cs="Consolas"/>
+          <w:sz w:val="20"/>
+          <w:szCs w:val="20"/>
+        </w:rPr>
+        <w:t xml:space="preserve"> -- </w:t>
+      </w:r>
+      <w:proofErr w:type="spellStart"/>
+      <w:r>
+        <w:rPr>
+          <w:rFonts w:ascii="Consolas" w:eastAsia="Consolas" w:hAnsi="Consolas" w:cs="Consolas"/>
+          <w:sz w:val="20"/>
+          <w:szCs w:val="20"/>
+        </w:rPr>
+        <w:t>dim_delito</w:t>
+      </w:r>
+      <w:proofErr w:type="spellEnd"/>
       <w:r>
         <w:rPr>
           <w:rFonts w:ascii="Consolas" w:eastAsia="Consolas" w:hAnsi="Consolas" w:cs="Consolas"/>
@@ -5913,8 +6108,18 @@
           <w:szCs w:val="20"/>
         </w:rPr>
         <w:br/>
-        <w:t xml:space="preserve">                 dim_victima</w:t>
-      </w:r>
+        <w:t xml:space="preserve">                 </w:t>
+      </w:r>
+      <w:proofErr w:type="spellStart"/>
+      <w:r>
+        <w:rPr>
+          <w:rFonts w:ascii="Consolas" w:eastAsia="Consolas" w:hAnsi="Consolas" w:cs="Consolas"/>
+          <w:sz w:val="20"/>
+          <w:szCs w:val="20"/>
+        </w:rPr>
+        <w:t>dim_victima</w:t>
+      </w:r>
+      <w:proofErr w:type="spellEnd"/>
     </w:p>
     <w:p>
       <w:pPr>
@@ -5934,7 +6139,23 @@
         <w:jc w:val="both"/>
       </w:pPr>
       <w:r>
-        <w:t>La tabla central del modelo es fact_homicidios. Esta tabla contiene un registro por cada homicidio intencional registrado en el dataset y almacena las claves que conectan con las dimensiones del modelo. Campos principales:</w:t>
+        <w:t xml:space="preserve">La tabla central del modelo es </w:t>
+      </w:r>
+      <w:proofErr w:type="spellStart"/>
+      <w:r>
+        <w:t>fact_homicidios</w:t>
+      </w:r>
+      <w:proofErr w:type="spellEnd"/>
+      <w:r>
+        <w:t xml:space="preserve">. Esta tabla contiene un registro por cada homicidio intencional registrado en el </w:t>
+      </w:r>
+      <w:proofErr w:type="spellStart"/>
+      <w:r>
+        <w:t>dataset</w:t>
+      </w:r>
+      <w:proofErr w:type="spellEnd"/>
+      <w:r>
+        <w:t xml:space="preserve"> y almacena las claves que conectan con las dimensiones del modelo. Campos principales:</w:t>
       </w:r>
     </w:p>
     <w:p>
@@ -5947,8 +6168,13 @@
         <w:spacing w:after="80" w:line="276" w:lineRule="auto"/>
         <w:jc w:val="both"/>
       </w:pPr>
-      <w:r>
-        <w:t>id_homicidio: identificador único del registro.</w:t>
+      <w:proofErr w:type="spellStart"/>
+      <w:r>
+        <w:t>id_homicidio</w:t>
+      </w:r>
+      <w:proofErr w:type="spellEnd"/>
+      <w:r>
+        <w:t>: identificador único del registro.</w:t>
       </w:r>
     </w:p>
     <w:p>
@@ -5961,8 +6187,13 @@
         <w:spacing w:after="80" w:line="276" w:lineRule="auto"/>
         <w:jc w:val="both"/>
       </w:pPr>
-      <w:r>
-        <w:t>id_fecha: clave de relación con la dimensión de tiempo.</w:t>
+      <w:proofErr w:type="spellStart"/>
+      <w:r>
+        <w:t>id_fecha</w:t>
+      </w:r>
+      <w:proofErr w:type="spellEnd"/>
+      <w:r>
+        <w:t>: clave de relación con la dimensión de tiempo.</w:t>
       </w:r>
     </w:p>
     <w:p>
@@ -5975,8 +6206,13 @@
         <w:spacing w:after="80" w:line="276" w:lineRule="auto"/>
         <w:jc w:val="both"/>
       </w:pPr>
-      <w:r>
-        <w:t>id_geografia: clave de relación con la dimensión geográfica.</w:t>
+      <w:proofErr w:type="spellStart"/>
+      <w:r>
+        <w:t>id_geografia</w:t>
+      </w:r>
+      <w:proofErr w:type="spellEnd"/>
+      <w:r>
+        <w:t>: clave de relación con la dimensión geográfica.</w:t>
       </w:r>
     </w:p>
     <w:p>
@@ -5989,8 +6225,13 @@
         <w:spacing w:after="80" w:line="276" w:lineRule="auto"/>
         <w:jc w:val="both"/>
       </w:pPr>
-      <w:r>
-        <w:t>id_delito: clave de relación con la dimensión del delito.</w:t>
+      <w:proofErr w:type="spellStart"/>
+      <w:r>
+        <w:t>id_delito</w:t>
+      </w:r>
+      <w:proofErr w:type="spellEnd"/>
+      <w:r>
+        <w:t>: clave de relación con la dimensión del delito.</w:t>
       </w:r>
     </w:p>
     <w:p>
@@ -6003,8 +6244,13 @@
         <w:spacing w:after="80" w:line="276" w:lineRule="auto"/>
         <w:jc w:val="both"/>
       </w:pPr>
-      <w:r>
-        <w:t>id_victima: clave de relación con la dimensión de víctima.</w:t>
+      <w:proofErr w:type="spellStart"/>
+      <w:r>
+        <w:t>id_victima</w:t>
+      </w:r>
+      <w:proofErr w:type="spellEnd"/>
+      <w:r>
+        <w:t>: clave de relación con la dimensión de víctima.</w:t>
       </w:r>
     </w:p>
     <w:p>
@@ -6017,8 +6263,13 @@
         <w:spacing w:after="80" w:line="276" w:lineRule="auto"/>
         <w:jc w:val="both"/>
       </w:pPr>
-      <w:r>
-        <w:t>fecha_infraccion: fecha del evento.</w:t>
+      <w:proofErr w:type="spellStart"/>
+      <w:r>
+        <w:t>fecha_infraccion</w:t>
+      </w:r>
+      <w:proofErr w:type="spellEnd"/>
+      <w:r>
+        <w:t>: fecha del evento.</w:t>
       </w:r>
     </w:p>
     <w:p>
@@ -6045,8 +6296,13 @@
         <w:spacing w:after="80" w:line="276" w:lineRule="auto"/>
         <w:jc w:val="both"/>
       </w:pPr>
-      <w:r>
-        <w:t>franja_horaria: clasificación temporal del evento.</w:t>
+      <w:proofErr w:type="spellStart"/>
+      <w:r>
+        <w:t>franja_horaria</w:t>
+      </w:r>
+      <w:proofErr w:type="spellEnd"/>
+      <w:r>
+        <w:t>: clasificación temporal del evento.</w:t>
       </w:r>
     </w:p>
     <w:p>
@@ -6059,8 +6315,13 @@
         <w:spacing w:after="80" w:line="276" w:lineRule="auto"/>
         <w:jc w:val="both"/>
       </w:pPr>
-      <w:r>
-        <w:t>edad_num: edad convertida a valor numérico.</w:t>
+      <w:proofErr w:type="spellStart"/>
+      <w:r>
+        <w:t>edad_num</w:t>
+      </w:r>
+      <w:proofErr w:type="spellEnd"/>
+      <w:r>
+        <w:t>: edad convertida a valor numérico.</w:t>
       </w:r>
     </w:p>
     <w:p>
@@ -6087,8 +6348,13 @@
         <w:spacing w:after="80" w:line="276" w:lineRule="auto"/>
         <w:jc w:val="both"/>
       </w:pPr>
-      <w:r>
-        <w:t>total_homicidios: medida base con valor 1 para permitir agregaciones.</w:t>
+      <w:proofErr w:type="spellStart"/>
+      <w:r>
+        <w:t>total_homicidios</w:t>
+      </w:r>
+      <w:proofErr w:type="spellEnd"/>
+      <w:r>
+        <w:t>: medida base con valor 1 para permitir agregaciones.</w:t>
       </w:r>
     </w:p>
     <w:p>
@@ -6097,7 +6363,15 @@
         <w:jc w:val="both"/>
       </w:pPr>
       <w:r>
-        <w:t>La medida total_homicidios permite calcular de manera directa el número de casos por provincia, cantón, mes, arma, lugar, sexo, edad u otra variable analítica.</w:t>
+        <w:t xml:space="preserve">La medida </w:t>
+      </w:r>
+      <w:proofErr w:type="spellStart"/>
+      <w:r>
+        <w:t>total_homicidios</w:t>
+      </w:r>
+      <w:proofErr w:type="spellEnd"/>
+      <w:r>
+        <w:t xml:space="preserve"> permite calcular de manera directa el número de casos por provincia, cantón, mes, arma, lugar, sexo, edad u otra variable analítica.</w:t>
       </w:r>
     </w:p>
     <w:p>
@@ -6118,7 +6392,67 @@
         <w:jc w:val="both"/>
       </w:pPr>
       <w:r>
-        <w:t>Dimensión Tiempo (dim_tiempo): permite analizar los eventos según componentes temporales, con campos como id_fecha, fecha, anio, mes, mes_nombre, dia, dia_semana, nombre_dia y semana. Responde preguntas sobre evolución mensual, días críticos, semanas de mayor incidencia y comportamiento temporal.</w:t>
+        <w:t>Dimensión Tiempo (</w:t>
+      </w:r>
+      <w:proofErr w:type="spellStart"/>
+      <w:r>
+        <w:t>dim_tiempo</w:t>
+      </w:r>
+      <w:proofErr w:type="spellEnd"/>
+      <w:r>
+        <w:t xml:space="preserve">): permite analizar los eventos según componentes temporales, con campos como </w:t>
+      </w:r>
+      <w:proofErr w:type="spellStart"/>
+      <w:r>
+        <w:t>id_fecha</w:t>
+      </w:r>
+      <w:proofErr w:type="spellEnd"/>
+      <w:r>
+        <w:t xml:space="preserve">, fecha, </w:t>
+      </w:r>
+      <w:proofErr w:type="spellStart"/>
+      <w:r>
+        <w:t>anio</w:t>
+      </w:r>
+      <w:proofErr w:type="spellEnd"/>
+      <w:r>
+        <w:t xml:space="preserve">, mes, </w:t>
+      </w:r>
+      <w:proofErr w:type="spellStart"/>
+      <w:r>
+        <w:t>mes_nombre</w:t>
+      </w:r>
+      <w:proofErr w:type="spellEnd"/>
+      <w:r>
+        <w:t xml:space="preserve">, </w:t>
+      </w:r>
+      <w:proofErr w:type="spellStart"/>
+      <w:r>
+        <w:t>dia</w:t>
+      </w:r>
+      <w:proofErr w:type="spellEnd"/>
+      <w:r>
+        <w:t xml:space="preserve">, </w:t>
+      </w:r>
+      <w:proofErr w:type="spellStart"/>
+      <w:r>
+        <w:t>dia_semana</w:t>
+      </w:r>
+      <w:proofErr w:type="spellEnd"/>
+      <w:r>
+        <w:t xml:space="preserve">, </w:t>
+      </w:r>
+      <w:proofErr w:type="spellStart"/>
+      <w:r>
+        <w:t>nombre_dia</w:t>
+      </w:r>
+      <w:proofErr w:type="spellEnd"/>
+      <w:r>
+        <w:t xml:space="preserve"> y semana. </w:t>
+      </w:r>
+      <w:r>
+        <w:lastRenderedPageBreak/>
+        <w:t>Responde preguntas sobre evolución mensual, días críticos, semanas de mayor incidencia y comportamiento temporal.</w:t>
       </w:r>
     </w:p>
     <w:p>
@@ -6127,7 +6461,47 @@
         <w:jc w:val="both"/>
       </w:pPr>
       <w:r>
-        <w:t>Dimensión Geografía (dim_geografia): permite analizar los homicidios desde una perspectiva territorial, con campos como id_geografia, codigo_provincia, provincia, codigo_canton, canton, zona, subzona, distrito, circuito y subcircuito. Identifica provincias, cantones, zonas y distritos con mayor concentración de casos.</w:t>
+        <w:t>Dimensión Geografía (</w:t>
+      </w:r>
+      <w:proofErr w:type="spellStart"/>
+      <w:r>
+        <w:t>dim_geografia</w:t>
+      </w:r>
+      <w:proofErr w:type="spellEnd"/>
+      <w:r>
+        <w:t xml:space="preserve">): permite analizar los homicidios desde una perspectiva territorial, con campos como </w:t>
+      </w:r>
+      <w:proofErr w:type="spellStart"/>
+      <w:r>
+        <w:t>id_geografia</w:t>
+      </w:r>
+      <w:proofErr w:type="spellEnd"/>
+      <w:r>
+        <w:t xml:space="preserve">, </w:t>
+      </w:r>
+      <w:proofErr w:type="spellStart"/>
+      <w:r>
+        <w:t>codigo_provincia</w:t>
+      </w:r>
+      <w:proofErr w:type="spellEnd"/>
+      <w:r>
+        <w:t xml:space="preserve">, provincia, </w:t>
+      </w:r>
+      <w:proofErr w:type="spellStart"/>
+      <w:r>
+        <w:t>codigo_canton</w:t>
+      </w:r>
+      <w:proofErr w:type="spellEnd"/>
+      <w:r>
+        <w:t xml:space="preserve">, </w:t>
+      </w:r>
+      <w:proofErr w:type="spellStart"/>
+      <w:r>
+        <w:t>canton</w:t>
+      </w:r>
+      <w:proofErr w:type="spellEnd"/>
+      <w:r>
+        <w:t>, zona, subzona, distrito, circuito y subcircuito. Identifica provincias, cantones, zonas y distritos con mayor concentración de casos.</w:t>
       </w:r>
     </w:p>
     <w:p>
@@ -6136,7 +6510,79 @@
         <w:jc w:val="both"/>
       </w:pPr>
       <w:r>
-        <w:t>Dimensión Delito (dim_delito): describe las características del evento delictivo mediante id_delito, tipo_muerte, arma, tipo_arma, presunta_motivacion, presun_motiva_observada, probable_causa_motivada, area_hecho, lugar y tipo_lugar. Caracteriza los homicidios por tipo de arma, lugar del hecho, motivación y causa probable.</w:t>
+        <w:t>Dimensión Delito (</w:t>
+      </w:r>
+      <w:proofErr w:type="spellStart"/>
+      <w:r>
+        <w:t>dim_delito</w:t>
+      </w:r>
+      <w:proofErr w:type="spellEnd"/>
+      <w:r>
+        <w:t xml:space="preserve">): describe las características del evento delictivo mediante </w:t>
+      </w:r>
+      <w:proofErr w:type="spellStart"/>
+      <w:r>
+        <w:t>id_delito</w:t>
+      </w:r>
+      <w:proofErr w:type="spellEnd"/>
+      <w:r>
+        <w:t xml:space="preserve">, </w:t>
+      </w:r>
+      <w:proofErr w:type="spellStart"/>
+      <w:r>
+        <w:t>tipo_muerte</w:t>
+      </w:r>
+      <w:proofErr w:type="spellEnd"/>
+      <w:r>
+        <w:t xml:space="preserve">, arma, </w:t>
+      </w:r>
+      <w:proofErr w:type="spellStart"/>
+      <w:r>
+        <w:t>tipo_arma</w:t>
+      </w:r>
+      <w:proofErr w:type="spellEnd"/>
+      <w:r>
+        <w:t xml:space="preserve">, </w:t>
+      </w:r>
+      <w:proofErr w:type="spellStart"/>
+      <w:r>
+        <w:t>presunta_motivacion</w:t>
+      </w:r>
+      <w:proofErr w:type="spellEnd"/>
+      <w:r>
+        <w:t xml:space="preserve">, </w:t>
+      </w:r>
+      <w:proofErr w:type="spellStart"/>
+      <w:r>
+        <w:t>presun_motiva_observada</w:t>
+      </w:r>
+      <w:proofErr w:type="spellEnd"/>
+      <w:r>
+        <w:t xml:space="preserve">, </w:t>
+      </w:r>
+      <w:proofErr w:type="spellStart"/>
+      <w:r>
+        <w:t>probable_causa_motivada</w:t>
+      </w:r>
+      <w:proofErr w:type="spellEnd"/>
+      <w:r>
+        <w:t xml:space="preserve">, </w:t>
+      </w:r>
+      <w:proofErr w:type="spellStart"/>
+      <w:r>
+        <w:t>area_hecho</w:t>
+      </w:r>
+      <w:proofErr w:type="spellEnd"/>
+      <w:r>
+        <w:t xml:space="preserve">, lugar y </w:t>
+      </w:r>
+      <w:proofErr w:type="spellStart"/>
+      <w:r>
+        <w:t>tipo_lugar</w:t>
+      </w:r>
+      <w:proofErr w:type="spellEnd"/>
+      <w:r>
+        <w:t>. Caracteriza los homicidios por tipo de arma, lugar del hecho, motivación y causa probable.</w:t>
       </w:r>
     </w:p>
     <w:p>
@@ -6145,7 +6591,47 @@
         <w:jc w:val="both"/>
       </w:pPr>
       <w:r>
-        <w:t>Dimensión Víctima (dim_victima): permite analizar características generales de la víctima de forma agregada mediante id_victima, sexo, genero, etnia, estado_civil, nacionalidad, discapacidad, profesion_registro_civil e instruccion. Se utiliza únicamente con fines estadísticos y de caracterización general, evitando interpretaciones discriminatorias o identificaciones individuales.</w:t>
+        <w:t>Dimensión Víctima (</w:t>
+      </w:r>
+      <w:proofErr w:type="spellStart"/>
+      <w:r>
+        <w:t>dim_victima</w:t>
+      </w:r>
+      <w:proofErr w:type="spellEnd"/>
+      <w:r>
+        <w:t xml:space="preserve">): permite analizar características generales de la víctima de forma agregada mediante </w:t>
+      </w:r>
+      <w:proofErr w:type="spellStart"/>
+      <w:r>
+        <w:t>id_victima</w:t>
+      </w:r>
+      <w:proofErr w:type="spellEnd"/>
+      <w:r>
+        <w:t xml:space="preserve">, sexo, genero, etnia, </w:t>
+      </w:r>
+      <w:proofErr w:type="spellStart"/>
+      <w:r>
+        <w:t>estado_civil</w:t>
+      </w:r>
+      <w:proofErr w:type="spellEnd"/>
+      <w:r>
+        <w:t xml:space="preserve">, nacionalidad, discapacidad, </w:t>
+      </w:r>
+      <w:proofErr w:type="spellStart"/>
+      <w:r>
+        <w:t>profesion_registro_civil</w:t>
+      </w:r>
+      <w:proofErr w:type="spellEnd"/>
+      <w:r>
+        <w:t xml:space="preserve"> e </w:t>
+      </w:r>
+      <w:proofErr w:type="spellStart"/>
+      <w:r>
+        <w:t>instruccion</w:t>
+      </w:r>
+      <w:proofErr w:type="spellEnd"/>
+      <w:r>
+        <w:t>. Se utiliza únicamente con fines estadísticos y de caracterización general, evitando interpretaciones discriminatorias o identificaciones individuales.</w:t>
       </w:r>
     </w:p>
     <w:p>
@@ -6179,8 +6665,37 @@
         <w:spacing w:after="80" w:line="276" w:lineRule="auto"/>
         <w:jc w:val="both"/>
       </w:pPr>
-      <w:r>
-        <w:t>fact_homicidios[id_fecha] se relaciona con dim_tiempo[id_fecha].</w:t>
+      <w:proofErr w:type="spellStart"/>
+      <w:r>
+        <w:t>fact_homicidios</w:t>
+      </w:r>
+      <w:proofErr w:type="spellEnd"/>
+      <w:r>
+        <w:t>[</w:t>
+      </w:r>
+      <w:proofErr w:type="spellStart"/>
+      <w:r>
+        <w:t>id_fecha</w:t>
+      </w:r>
+      <w:proofErr w:type="spellEnd"/>
+      <w:r>
+        <w:t xml:space="preserve">] se relaciona con </w:t>
+      </w:r>
+      <w:proofErr w:type="spellStart"/>
+      <w:r>
+        <w:t>dim_tiempo</w:t>
+      </w:r>
+      <w:proofErr w:type="spellEnd"/>
+      <w:r>
+        <w:t>[</w:t>
+      </w:r>
+      <w:proofErr w:type="spellStart"/>
+      <w:r>
+        <w:t>id_fecha</w:t>
+      </w:r>
+      <w:proofErr w:type="spellEnd"/>
+      <w:r>
+        <w:t>].</w:t>
       </w:r>
     </w:p>
     <w:p>
@@ -6193,8 +6708,37 @@
         <w:spacing w:after="80" w:line="276" w:lineRule="auto"/>
         <w:jc w:val="both"/>
       </w:pPr>
-      <w:r>
-        <w:t>fact_homicidios[id_geografia] se relaciona con dim_geografia[id_geografia].</w:t>
+      <w:proofErr w:type="spellStart"/>
+      <w:r>
+        <w:t>fact_homicidios</w:t>
+      </w:r>
+      <w:proofErr w:type="spellEnd"/>
+      <w:r>
+        <w:t>[</w:t>
+      </w:r>
+      <w:proofErr w:type="spellStart"/>
+      <w:r>
+        <w:t>id_geografia</w:t>
+      </w:r>
+      <w:proofErr w:type="spellEnd"/>
+      <w:r>
+        <w:t xml:space="preserve">] se relaciona con </w:t>
+      </w:r>
+      <w:proofErr w:type="spellStart"/>
+      <w:r>
+        <w:t>dim_geografia</w:t>
+      </w:r>
+      <w:proofErr w:type="spellEnd"/>
+      <w:r>
+        <w:t>[</w:t>
+      </w:r>
+      <w:proofErr w:type="spellStart"/>
+      <w:r>
+        <w:t>id_geografia</w:t>
+      </w:r>
+      <w:proofErr w:type="spellEnd"/>
+      <w:r>
+        <w:t>].</w:t>
       </w:r>
     </w:p>
     <w:p>
@@ -6207,8 +6751,37 @@
         <w:spacing w:after="80" w:line="276" w:lineRule="auto"/>
         <w:jc w:val="both"/>
       </w:pPr>
-      <w:r>
-        <w:t>fact_homicidios[id_delito] se relaciona con dim_delito[id_delito].</w:t>
+      <w:proofErr w:type="spellStart"/>
+      <w:r>
+        <w:t>fact_homicidios</w:t>
+      </w:r>
+      <w:proofErr w:type="spellEnd"/>
+      <w:r>
+        <w:t>[</w:t>
+      </w:r>
+      <w:proofErr w:type="spellStart"/>
+      <w:r>
+        <w:t>id_delito</w:t>
+      </w:r>
+      <w:proofErr w:type="spellEnd"/>
+      <w:r>
+        <w:t xml:space="preserve">] se relaciona con </w:t>
+      </w:r>
+      <w:proofErr w:type="spellStart"/>
+      <w:r>
+        <w:t>dim_delito</w:t>
+      </w:r>
+      <w:proofErr w:type="spellEnd"/>
+      <w:r>
+        <w:t>[</w:t>
+      </w:r>
+      <w:proofErr w:type="spellStart"/>
+      <w:r>
+        <w:t>id_delito</w:t>
+      </w:r>
+      <w:proofErr w:type="spellEnd"/>
+      <w:r>
+        <w:t>].</w:t>
       </w:r>
     </w:p>
     <w:p>
@@ -6221,8 +6794,37 @@
         <w:spacing w:after="80" w:line="276" w:lineRule="auto"/>
         <w:jc w:val="both"/>
       </w:pPr>
-      <w:r>
-        <w:t>fact_homicidios[id_victima] se relaciona con dim_victima[id_victima].</w:t>
+      <w:proofErr w:type="spellStart"/>
+      <w:r>
+        <w:t>fact_homicidios</w:t>
+      </w:r>
+      <w:proofErr w:type="spellEnd"/>
+      <w:r>
+        <w:t>[</w:t>
+      </w:r>
+      <w:proofErr w:type="spellStart"/>
+      <w:r>
+        <w:t>id_victima</w:t>
+      </w:r>
+      <w:proofErr w:type="spellEnd"/>
+      <w:r>
+        <w:t xml:space="preserve">] se relaciona con </w:t>
+      </w:r>
+      <w:proofErr w:type="spellStart"/>
+      <w:r>
+        <w:t>dim_victima</w:t>
+      </w:r>
+      <w:proofErr w:type="spellEnd"/>
+      <w:r>
+        <w:t>[</w:t>
+      </w:r>
+      <w:proofErr w:type="spellStart"/>
+      <w:r>
+        <w:t>id_victima</w:t>
+      </w:r>
+      <w:proofErr w:type="spellEnd"/>
+      <w:r>
+        <w:t>].</w:t>
       </w:r>
     </w:p>
     <w:p>
@@ -6252,7 +6854,31 @@
         <w:jc w:val="both"/>
       </w:pPr>
       <w:r>
-        <w:t>El proceso ETL fue implementado en Python mediante el script src/etl/transform_load.py. El objetivo del pipeline es leer el archivo Excel original, limpiar los datos, normalizar tipos, crear claves analíticas y generar archivos CSV procesados para Power BI, Streamlit y el análisis posterior.</w:t>
+        <w:t xml:space="preserve">El proceso ETL fue implementado en Python mediante el script </w:t>
+      </w:r>
+      <w:proofErr w:type="spellStart"/>
+      <w:r>
+        <w:t>src</w:t>
+      </w:r>
+      <w:proofErr w:type="spellEnd"/>
+      <w:r>
+        <w:t>/</w:t>
+      </w:r>
+      <w:proofErr w:type="spellStart"/>
+      <w:r>
+        <w:t>etl</w:t>
+      </w:r>
+      <w:proofErr w:type="spellEnd"/>
+      <w:r>
+        <w:t xml:space="preserve">/transform_load.py. El objetivo del pipeline es leer el archivo Excel original, limpiar los datos, normalizar tipos, crear claves analíticas y generar archivos CSV procesados para Power BI, </w:t>
+      </w:r>
+      <w:proofErr w:type="spellStart"/>
+      <w:r>
+        <w:t>Streamlit</w:t>
+      </w:r>
+      <w:proofErr w:type="spellEnd"/>
+      <w:r>
+        <w:t xml:space="preserve"> y el análisis posterior.</w:t>
       </w:r>
     </w:p>
     <w:p>
@@ -6294,7 +6920,15 @@
         <w:jc w:val="both"/>
       </w:pPr>
       <w:r>
-        <w:t>Durante la fase de extracción se realiza la lectura del archivo Excel, la selección de la hoja principal de homicidios intencionales, la normalización de nombres de columnas mediante eliminación de espacios al inicio o final, y la copia del dataset original a formato CSV en data/raw/ para trazabilidad. Archivo generado: data/raw/homicidios_intencionales_2026_enero_mayo.csv.</w:t>
+        <w:t xml:space="preserve">Durante la fase de extracción se realiza la lectura del archivo Excel, la selección de la hoja principal de homicidios intencionales, la normalización de nombres de columnas mediante eliminación de espacios al inicio o final, y la copia del </w:t>
+      </w:r>
+      <w:proofErr w:type="spellStart"/>
+      <w:r>
+        <w:t>dataset</w:t>
+      </w:r>
+      <w:proofErr w:type="spellEnd"/>
+      <w:r>
+        <w:t xml:space="preserve"> original a formato CSV en data/raw/ para trazabilidad. Archivo generado: data/raw/homicidios_intencionales_2026_enero_mayo.csv.</w:t>
       </w:r>
     </w:p>
     <w:p>
@@ -6315,7 +6949,11 @@
         <w:jc w:val="both"/>
       </w:pPr>
       <w:r>
-        <w:t>Limpieza de texto: las columnas de tipo texto fueron normalizadas mediante conversión a tipo texto, eliminación de espacios innecesarios, reemplazo de espacios múltiples por un solo espacio y reemplazo de valores nulos por SIN_DATO. Esto evita duplicidades ocasionadas por diferencias de formato.</w:t>
+        <w:t xml:space="preserve">Limpieza de texto: las columnas de tipo texto fueron normalizadas mediante conversión a tipo texto, eliminación de espacios innecesarios, reemplazo de espacios múltiples por un solo espacio y </w:t>
+      </w:r>
+      <w:r>
+        <w:lastRenderedPageBreak/>
+        <w:t>reemplazo de valores nulos por SIN_DATO. Esto evita duplicidades ocasionadas por diferencias de formato.</w:t>
       </w:r>
     </w:p>
     <w:p>
@@ -6324,7 +6962,23 @@
         <w:jc w:val="both"/>
       </w:pPr>
       <w:r>
-        <w:t>Tipado de fechas y horas: la columna fecha_infraccion fue convertida a tipo fecha y a partir de ella se generaron campos temporales (año, mes, día, día de semana y semana). La columna hora_infraccion se transformó para extraer la hora numérica y clasificarla en franjas horarias: Madrugada, Mañana, Tarde y Noche.</w:t>
+        <w:t xml:space="preserve">Tipado de fechas y horas: la columna </w:t>
+      </w:r>
+      <w:proofErr w:type="spellStart"/>
+      <w:r>
+        <w:t>fecha_infraccion</w:t>
+      </w:r>
+      <w:proofErr w:type="spellEnd"/>
+      <w:r>
+        <w:t xml:space="preserve"> fue convertida a tipo fecha y a partir de ella se generaron campos temporales (año, mes, día, día de semana y semana). La columna </w:t>
+      </w:r>
+      <w:proofErr w:type="spellStart"/>
+      <w:r>
+        <w:t>hora_infraccion</w:t>
+      </w:r>
+      <w:proofErr w:type="spellEnd"/>
+      <w:r>
+        <w:t xml:space="preserve"> se transformó para extraer la hora numérica y clasificarla en franjas horarias: Madrugada, Mañana, Tarde y Noche.</w:t>
       </w:r>
     </w:p>
     <w:p>
@@ -6333,7 +6987,23 @@
         <w:jc w:val="both"/>
       </w:pPr>
       <w:r>
-        <w:t>Conversión de edad: la columna edad fue convertida a valor numérico en edad_num. Los valores no numéricos como SIN_DATO o NO DETERMINADO fueron convertidos a valores nulos controlados. En el reporte de calidad, la variable edad_num presenta 2,75% de valores nulos, lo cual es aceptable para el análisis.</w:t>
+        <w:t xml:space="preserve">Conversión de edad: la columna edad fue convertida a valor numérico en </w:t>
+      </w:r>
+      <w:proofErr w:type="spellStart"/>
+      <w:r>
+        <w:t>edad_num</w:t>
+      </w:r>
+      <w:proofErr w:type="spellEnd"/>
+      <w:r>
+        <w:t xml:space="preserve">. Los valores no numéricos como SIN_DATO o NO DETERMINADO fueron convertidos a valores nulos controlados. En el reporte de calidad, la variable </w:t>
+      </w:r>
+      <w:proofErr w:type="spellStart"/>
+      <w:r>
+        <w:t>edad_num</w:t>
+      </w:r>
+      <w:proofErr w:type="spellEnd"/>
+      <w:r>
+        <w:t xml:space="preserve"> presenta 2,75% de valores nulos, lo cual es aceptable para el análisis.</w:t>
       </w:r>
     </w:p>
     <w:p>
@@ -6342,7 +7012,23 @@
         <w:jc w:val="both"/>
       </w:pPr>
       <w:r>
-        <w:t>Normalización de coordenadas: las coordenadas originales tenían separador decimal con coma, por lo que se transformaron a formato numérico usando punto decimal; coordenada_y se convirtió en latitud y coordenada_x en longitud. El reporte de calidad indica 100% de coordenadas válidas.</w:t>
+        <w:t xml:space="preserve">Normalización de coordenadas: las coordenadas originales tenían separador decimal con coma, por lo que se transformaron a formato numérico usando punto decimal; </w:t>
+      </w:r>
+      <w:proofErr w:type="spellStart"/>
+      <w:r>
+        <w:t>coordenada_y</w:t>
+      </w:r>
+      <w:proofErr w:type="spellEnd"/>
+      <w:r>
+        <w:t xml:space="preserve"> se convirtió en latitud y </w:t>
+      </w:r>
+      <w:proofErr w:type="spellStart"/>
+      <w:r>
+        <w:t>coordenada_x</w:t>
+      </w:r>
+      <w:proofErr w:type="spellEnd"/>
+      <w:r>
+        <w:t xml:space="preserve"> en longitud. El reporte de calidad indica 100% de coordenadas válidas.</w:t>
       </w:r>
     </w:p>
     <w:p>
@@ -6351,7 +7037,55 @@
         <w:jc w:val="both"/>
       </w:pPr>
       <w:r>
-        <w:t>Creación de claves analíticas: se generaron las claves id_homicidio, id_fecha, id_geografia, id_delito e id_victima, que permiten estructurar el dataset en un modelo estrella y facilitan la creación de relaciones en Power BI.</w:t>
+        <w:t xml:space="preserve">Creación de claves analíticas: se generaron las claves </w:t>
+      </w:r>
+      <w:proofErr w:type="spellStart"/>
+      <w:r>
+        <w:t>id_homicidio</w:t>
+      </w:r>
+      <w:proofErr w:type="spellEnd"/>
+      <w:r>
+        <w:t xml:space="preserve">, </w:t>
+      </w:r>
+      <w:proofErr w:type="spellStart"/>
+      <w:r>
+        <w:t>id_fecha</w:t>
+      </w:r>
+      <w:proofErr w:type="spellEnd"/>
+      <w:r>
+        <w:t xml:space="preserve">, </w:t>
+      </w:r>
+      <w:proofErr w:type="spellStart"/>
+      <w:r>
+        <w:t>id_geografia</w:t>
+      </w:r>
+      <w:proofErr w:type="spellEnd"/>
+      <w:r>
+        <w:t xml:space="preserve">, </w:t>
+      </w:r>
+      <w:proofErr w:type="spellStart"/>
+      <w:r>
+        <w:t>id_delito</w:t>
+      </w:r>
+      <w:proofErr w:type="spellEnd"/>
+      <w:r>
+        <w:t xml:space="preserve"> e </w:t>
+      </w:r>
+      <w:proofErr w:type="spellStart"/>
+      <w:r>
+        <w:t>id_victima</w:t>
+      </w:r>
+      <w:proofErr w:type="spellEnd"/>
+      <w:r>
+        <w:t xml:space="preserve">, que permiten estructurar el </w:t>
+      </w:r>
+      <w:proofErr w:type="spellStart"/>
+      <w:r>
+        <w:t>dataset</w:t>
+      </w:r>
+      <w:proofErr w:type="spellEnd"/>
+      <w:r>
+        <w:t xml:space="preserve"> en un modelo estrella y facilitan la creación de relaciones en Power BI.</w:t>
       </w:r>
     </w:p>
     <w:p>
@@ -6372,7 +7106,28 @@
         <w:jc w:val="both"/>
       </w:pPr>
       <w:r>
-        <w:t>La fase de carga generó los archivos procesados en la carpeta data/processed/: fact_homicidios.csv, dim_tiempo.csv, dim_geografia.csv, dim_delito.csv, dim_victima.csv y reporte_calidad.json.</w:t>
+        <w:t>La fase de carga generó los archivos procesados en la carpeta data/</w:t>
+      </w:r>
+      <w:proofErr w:type="spellStart"/>
+      <w:r>
+        <w:t>processed</w:t>
+      </w:r>
+      <w:proofErr w:type="spellEnd"/>
+      <w:r>
+        <w:t xml:space="preserve">/: fact_homicidios.csv, dim_tiempo.csv, dim_geografia.csv, dim_delito.csv, dim_victima.csv y </w:t>
+      </w:r>
+      <w:proofErr w:type="spellStart"/>
+      <w:r>
+        <w:t>reporte_</w:t>
+      </w:r>
+      <w:proofErr w:type="gramStart"/>
+      <w:r>
+        <w:t>calidad.json</w:t>
+      </w:r>
+      <w:proofErr w:type="spellEnd"/>
+      <w:proofErr w:type="gramEnd"/>
+      <w:r>
+        <w:t>.</w:t>
       </w:r>
     </w:p>
     <w:p>
@@ -6410,12 +7165,6 @@
         <w:gridCol w:w="2400"/>
       </w:tblGrid>
       <w:tr>
-        <w:tblPrEx>
-          <w:tblCellMar>
-            <w:top w:w="0" w:type="dxa"/>
-            <w:bottom w:w="0" w:type="dxa"/>
-          </w:tblCellMar>
-        </w:tblPrEx>
         <w:trPr>
           <w:tblHeader/>
         </w:trPr>
@@ -6502,12 +7251,6 @@
         </w:tc>
       </w:tr>
       <w:tr>
-        <w:tblPrEx>
-          <w:tblCellMar>
-            <w:top w:w="0" w:type="dxa"/>
-            <w:bottom w:w="0" w:type="dxa"/>
-          </w:tblCellMar>
-        </w:tblPrEx>
         <w:tc>
           <w:tcPr>
             <w:tcW w:w="4200" w:type="dxa"/>
@@ -6519,6 +7262,7 @@
             </w:tcMar>
           </w:tcPr>
           <w:p>
+            <w:proofErr w:type="spellStart"/>
             <w:r>
               <w:rPr>
                 <w:sz w:val="22"/>
@@ -6526,6 +7270,7 @@
               </w:rPr>
               <w:t>fact_homicidios</w:t>
             </w:r>
+            <w:proofErr w:type="spellEnd"/>
           </w:p>
         </w:tc>
         <w:tc>
@@ -6576,12 +7321,6 @@
         </w:tc>
       </w:tr>
       <w:tr>
-        <w:tblPrEx>
-          <w:tblCellMar>
-            <w:top w:w="0" w:type="dxa"/>
-            <w:bottom w:w="0" w:type="dxa"/>
-          </w:tblCellMar>
-        </w:tblPrEx>
         <w:tc>
           <w:tcPr>
             <w:tcW w:w="4200" w:type="dxa"/>
@@ -6594,6 +7333,7 @@
             </w:tcMar>
           </w:tcPr>
           <w:p>
+            <w:proofErr w:type="spellStart"/>
             <w:r>
               <w:rPr>
                 <w:sz w:val="22"/>
@@ -6601,6 +7341,7 @@
               </w:rPr>
               <w:t>dim_tiempo</w:t>
             </w:r>
+            <w:proofErr w:type="spellEnd"/>
           </w:p>
         </w:tc>
         <w:tc>
@@ -6653,12 +7394,6 @@
         </w:tc>
       </w:tr>
       <w:tr>
-        <w:tblPrEx>
-          <w:tblCellMar>
-            <w:top w:w="0" w:type="dxa"/>
-            <w:bottom w:w="0" w:type="dxa"/>
-          </w:tblCellMar>
-        </w:tblPrEx>
         <w:tc>
           <w:tcPr>
             <w:tcW w:w="4200" w:type="dxa"/>
@@ -6670,6 +7405,7 @@
             </w:tcMar>
           </w:tcPr>
           <w:p>
+            <w:proofErr w:type="spellStart"/>
             <w:r>
               <w:rPr>
                 <w:sz w:val="22"/>
@@ -6677,6 +7413,7 @@
               </w:rPr>
               <w:t>dim_geografia</w:t>
             </w:r>
+            <w:proofErr w:type="spellEnd"/>
           </w:p>
         </w:tc>
         <w:tc>
@@ -6727,12 +7464,6 @@
         </w:tc>
       </w:tr>
       <w:tr>
-        <w:tblPrEx>
-          <w:tblCellMar>
-            <w:top w:w="0" w:type="dxa"/>
-            <w:bottom w:w="0" w:type="dxa"/>
-          </w:tblCellMar>
-        </w:tblPrEx>
         <w:tc>
           <w:tcPr>
             <w:tcW w:w="4200" w:type="dxa"/>
@@ -6745,6 +7476,7 @@
             </w:tcMar>
           </w:tcPr>
           <w:p>
+            <w:proofErr w:type="spellStart"/>
             <w:r>
               <w:rPr>
                 <w:sz w:val="22"/>
@@ -6752,6 +7484,7 @@
               </w:rPr>
               <w:t>dim_delito</w:t>
             </w:r>
+            <w:proofErr w:type="spellEnd"/>
           </w:p>
         </w:tc>
         <w:tc>
@@ -6804,12 +7537,6 @@
         </w:tc>
       </w:tr>
       <w:tr>
-        <w:tblPrEx>
-          <w:tblCellMar>
-            <w:top w:w="0" w:type="dxa"/>
-            <w:bottom w:w="0" w:type="dxa"/>
-          </w:tblCellMar>
-        </w:tblPrEx>
         <w:tc>
           <w:tcPr>
             <w:tcW w:w="4200" w:type="dxa"/>
@@ -6821,6 +7548,7 @@
             </w:tcMar>
           </w:tcPr>
           <w:p>
+            <w:proofErr w:type="spellStart"/>
             <w:r>
               <w:rPr>
                 <w:sz w:val="22"/>
@@ -6828,6 +7556,7 @@
               </w:rPr>
               <w:t>dim_victima</w:t>
             </w:r>
+            <w:proofErr w:type="spellEnd"/>
           </w:p>
         </w:tc>
         <w:tc>
@@ -6983,6 +7712,7 @@
       </w:pPr>
       <w:bookmarkStart w:id="28" w:name="_Toc234523502"/>
       <w:r>
+        <w:lastRenderedPageBreak/>
         <w:t>2.3. Cumplimiento Normativo y Protección de Datos</w:t>
       </w:r>
       <w:bookmarkEnd w:id="28"/>
@@ -7035,7 +7765,15 @@
         <w:jc w:val="both"/>
       </w:pPr>
       <w:r>
-        <w:t>Aunque el dataset contiene variables como sexo, género, etnia, nacionalidad e instrucción, estas se utilizan exclusivamente para análisis estadístico y descriptivo. No se emplean para generar perfiles discriminatorios ni decisiones automatizadas sobre individuos.</w:t>
+        <w:t xml:space="preserve">Aunque el </w:t>
+      </w:r>
+      <w:proofErr w:type="spellStart"/>
+      <w:r>
+        <w:t>dataset</w:t>
+      </w:r>
+      <w:proofErr w:type="spellEnd"/>
+      <w:r>
+        <w:t xml:space="preserve"> contiene variables como sexo, género, etnia, nacionalidad e instrucción, estas se utilizan exclusivamente para análisis estadístico y descriptivo. No se emplean para generar perfiles discriminatorios ni decisiones automatizadas sobre individuos.</w:t>
       </w:r>
     </w:p>
     <w:p>
@@ -7066,8 +7804,13 @@
         <w:spacing w:line="276" w:lineRule="auto"/>
       </w:pPr>
       <w:bookmarkStart w:id="32" w:name="_Toc234523506"/>
-      <w:r>
-        <w:t>Anonimización y Ausencia de Identificadores Directos</w:t>
+      <w:proofErr w:type="spellStart"/>
+      <w:r>
+        <w:t>Anonimización</w:t>
+      </w:r>
+      <w:proofErr w:type="spellEnd"/>
+      <w:r>
+        <w:t xml:space="preserve"> y Ausencia de Identificadores Directos</w:t>
       </w:r>
       <w:bookmarkEnd w:id="32"/>
     </w:p>
@@ -7077,7 +7820,15 @@
         <w:jc w:val="both"/>
       </w:pPr>
       <w:r>
-        <w:t>El dataset trabajado no incluye nombres, números de identificación personal, direcciones exactas de personas, teléfonos ni otros identificadores directos. Aun así, se mantiene una postura preventiva debido a la sensibilidad del dominio.</w:t>
+        <w:t xml:space="preserve">El </w:t>
+      </w:r>
+      <w:proofErr w:type="spellStart"/>
+      <w:r>
+        <w:t>dataset</w:t>
+      </w:r>
+      <w:proofErr w:type="spellEnd"/>
+      <w:r>
+        <w:t xml:space="preserve"> trabajado no incluye nombres, números de identificación personal, direcciones exactas de personas, teléfonos ni otros identificadores directos. Aun así, se mantiene una postura preventiva debido a la sensibilidad del dominio.</w:t>
       </w:r>
     </w:p>
     <w:p>
@@ -7098,7 +7849,39 @@
         <w:jc w:val="both"/>
       </w:pPr>
       <w:r>
-        <w:t>El pipeline ETL conserva trazabilidad mediante el archivo fuente original, la copia procesada en data/raw/, las tablas analíticas en data/processed/, el reporte de calidad en formato JSON y los scripts reproducibles en src/etl/. Esto permite auditar cómo se transformaron los datos desde el Excel original hasta el modelo analítico utilizado en el dashboard.</w:t>
+        <w:t>El pipeline ETL conserva trazabilidad mediante el archivo fuente original, la copia procesada en data/raw/, las tablas analíticas en data/</w:t>
+      </w:r>
+      <w:proofErr w:type="spellStart"/>
+      <w:r>
+        <w:t>processed</w:t>
+      </w:r>
+      <w:proofErr w:type="spellEnd"/>
+      <w:r>
+        <w:t xml:space="preserve">/, el reporte de calidad en formato JSON y los scripts reproducibles en </w:t>
+      </w:r>
+      <w:proofErr w:type="spellStart"/>
+      <w:r>
+        <w:t>src</w:t>
+      </w:r>
+      <w:proofErr w:type="spellEnd"/>
+      <w:r>
+        <w:t>/</w:t>
+      </w:r>
+      <w:proofErr w:type="spellStart"/>
+      <w:r>
+        <w:t>etl</w:t>
+      </w:r>
+      <w:proofErr w:type="spellEnd"/>
+      <w:r>
+        <w:t xml:space="preserve">/. Esto permite auditar cómo se transformaron los datos desde el Excel original hasta el modelo analítico utilizado en el </w:t>
+      </w:r>
+      <w:proofErr w:type="spellStart"/>
+      <w:r>
+        <w:t>dashboard</w:t>
+      </w:r>
+      <w:proofErr w:type="spellEnd"/>
+      <w:r>
+        <w:t>.</w:t>
       </w:r>
     </w:p>
     <w:p>
@@ -7130,6 +7913,7 @@
       </w:pPr>
       <w:bookmarkStart w:id="35" w:name="_Toc234523509"/>
       <w:r>
+        <w:lastRenderedPageBreak/>
         <w:t>Fase 3: Analítica Descriptiva, Diagnóstica y Visualización</w:t>
       </w:r>
       <w:bookmarkEnd w:id="35"/>
@@ -7152,7 +7936,23 @@
         <w:jc w:val="both"/>
       </w:pPr>
       <w:r>
-        <w:t>El análisis exploratorio de datos permite comprender la estructura, distribución y comportamiento de los homicidios intencionales registrados en el dataset. Esta fase se desarrolló a partir de las tablas generadas en el modelo estrella, principalmente fact_homicidios y sus dimensiones asociadas.</w:t>
+        <w:t xml:space="preserve">El análisis exploratorio de datos permite comprender la estructura, distribución y comportamiento de los homicidios intencionales registrados en el </w:t>
+      </w:r>
+      <w:proofErr w:type="spellStart"/>
+      <w:r>
+        <w:t>dataset</w:t>
+      </w:r>
+      <w:proofErr w:type="spellEnd"/>
+      <w:r>
+        <w:t xml:space="preserve">. Esta fase se desarrolló a partir de las tablas generadas en el modelo estrella, principalmente </w:t>
+      </w:r>
+      <w:proofErr w:type="spellStart"/>
+      <w:r>
+        <w:t>fact_homicidios</w:t>
+      </w:r>
+      <w:proofErr w:type="spellEnd"/>
+      <w:r>
+        <w:t xml:space="preserve"> y sus dimensiones asociadas.</w:t>
       </w:r>
     </w:p>
     <w:p>
@@ -7195,8 +7995,13 @@
         <w:spacing w:after="80" w:line="276" w:lineRule="auto"/>
         <w:jc w:val="both"/>
       </w:pPr>
-      <w:r>
-        <w:t>Total de homicidios: 3.485 registros.</w:t>
+      <w:proofErr w:type="gramStart"/>
+      <w:r>
+        <w:t>Total</w:t>
+      </w:r>
+      <w:proofErr w:type="gramEnd"/>
+      <w:r>
+        <w:t xml:space="preserve"> de homicidios: 3.485 registros.</w:t>
       </w:r>
     </w:p>
     <w:p>
@@ -7310,12 +8115,6 @@
         <w:gridCol w:w="1350"/>
       </w:tblGrid>
       <w:tr>
-        <w:tblPrEx>
-          <w:tblCellMar>
-            <w:top w:w="0" w:type="dxa"/>
-            <w:bottom w:w="0" w:type="dxa"/>
-          </w:tblCellMar>
-        </w:tblPrEx>
         <w:trPr>
           <w:tblHeader/>
         </w:trPr>
@@ -7415,6 +8214,7 @@
             <w:pPr>
               <w:jc w:val="center"/>
             </w:pPr>
+            <w:proofErr w:type="spellStart"/>
             <w:r>
               <w:rPr>
                 <w:b/>
@@ -7423,7 +8223,40 @@
                 <w:sz w:val="22"/>
                 <w:szCs w:val="22"/>
               </w:rPr>
-              <w:t>Desv. est.</w:t>
+              <w:t>Desv</w:t>
+            </w:r>
+            <w:proofErr w:type="spellEnd"/>
+            <w:r>
+              <w:rPr>
+                <w:b/>
+                <w:bCs/>
+                <w:color w:val="FFFFFF"/>
+                <w:sz w:val="22"/>
+                <w:szCs w:val="22"/>
+              </w:rPr>
+              <w:t xml:space="preserve">. </w:t>
+            </w:r>
+            <w:proofErr w:type="spellStart"/>
+            <w:r>
+              <w:rPr>
+                <w:b/>
+                <w:bCs/>
+                <w:color w:val="FFFFFF"/>
+                <w:sz w:val="22"/>
+                <w:szCs w:val="22"/>
+              </w:rPr>
+              <w:t>est</w:t>
+            </w:r>
+            <w:proofErr w:type="spellEnd"/>
+            <w:r>
+              <w:rPr>
+                <w:b/>
+                <w:bCs/>
+                <w:color w:val="FFFFFF"/>
+                <w:sz w:val="22"/>
+                <w:szCs w:val="22"/>
+              </w:rPr>
+              <w:t>.</w:t>
             </w:r>
           </w:p>
         </w:tc>
@@ -7456,12 +8289,6 @@
         </w:tc>
       </w:tr>
       <w:tr>
-        <w:tblPrEx>
-          <w:tblCellMar>
-            <w:top w:w="0" w:type="dxa"/>
-            <w:bottom w:w="0" w:type="dxa"/>
-          </w:tblCellMar>
-        </w:tblPrEx>
         <w:tc>
           <w:tcPr>
             <w:tcW w:w="3600" w:type="dxa"/>
@@ -7576,12 +8403,6 @@
         </w:tc>
       </w:tr>
       <w:tr>
-        <w:tblPrEx>
-          <w:tblCellMar>
-            <w:top w:w="0" w:type="dxa"/>
-            <w:bottom w:w="0" w:type="dxa"/>
-          </w:tblCellMar>
-        </w:tblPrEx>
         <w:tc>
           <w:tcPr>
             <w:tcW w:w="3600" w:type="dxa"/>
@@ -7701,12 +8522,6 @@
         </w:tc>
       </w:tr>
       <w:tr>
-        <w:tblPrEx>
-          <w:tblCellMar>
-            <w:top w:w="0" w:type="dxa"/>
-            <w:bottom w:w="0" w:type="dxa"/>
-          </w:tblCellMar>
-        </w:tblPrEx>
         <w:tc>
           <w:tcPr>
             <w:tcW w:w="3600" w:type="dxa"/>
@@ -7833,10 +8648,15 @@
         <w:jc w:val="both"/>
       </w:pPr>
       <w:r>
-        <w:t>La lectura de estas medidas es reveladora. La edad presenta una dispersión moderada (CV 38,7%), con un rango intercuartílico de 23 a 39 años, lo que confirma un perfil etario relativamente concentrado en población joven-adulta. La incidencia diaria nacional es bastante estable (CV 32,5%): en promedio ocurren 23 homicidios por día, con un mínimo de 9 y un máximo de 50. En contraste, la incidencia por provincia muestra una dispersión extrema (CV 218,4%): la media es de 151,5 casos pero la mediana es apenas 23</w:t>
-      </w:r>
-      <w:r>
-        <w:t>, y la desviación estándar (330,9) supera ampliamente a la media. Esta gran diferencia entre media y mediana evidencia una distribución fuertemente asimétrica hacia la derecha, dominada por unos pocos territorios atípicos (Guayas, con 1.521 casos, frente a provincias con apenas 4). Estadísticamente, esto justifica el enfoque de priorización territorial del proyecto.</w:t>
+        <w:t xml:space="preserve">La lectura de estas medidas es reveladora. La edad presenta una dispersión moderada (CV 38,7%), con un rango intercuartílico de 23 a 39 años, lo que confirma un perfil etario relativamente concentrado en población joven-adulta. La incidencia diaria nacional es bastante estable (CV 32,5%): en promedio ocurren 23 homicidios por día, con un mínimo de 9 y un máximo de 50. En contraste, la incidencia por provincia muestra una dispersión extrema (CV 218,4%): la media es de 151,5 </w:t>
+      </w:r>
+      <w:proofErr w:type="gramStart"/>
+      <w:r>
+        <w:t>casos</w:t>
+      </w:r>
+      <w:proofErr w:type="gramEnd"/>
+      <w:r>
+        <w:t xml:space="preserve"> pero la mediana es apenas 23, y la desviación estándar (330,9) supera ampliamente a la media. Esta gran diferencia entre media y mediana evidencia una distribución fuertemente asimétrica hacia la derecha, dominada por unos pocos territorios atípicos (Guayas, con 1.521 casos, frente a provincias con apenas 4). Estadísticamente, esto justifica el enfoque de priorización territorial del proyecto.</w:t>
       </w:r>
     </w:p>
     <w:p>
@@ -7847,6 +8667,7 @@
       </w:pPr>
       <w:bookmarkStart w:id="39" w:name="_Toc234523513"/>
       <w:r>
+        <w:lastRenderedPageBreak/>
         <w:t>Distribución por Territorio</w:t>
       </w:r>
       <w:bookmarkEnd w:id="39"/>
@@ -7882,12 +8703,6 @@
         <w:gridCol w:w="3600"/>
       </w:tblGrid>
       <w:tr>
-        <w:tblPrEx>
-          <w:tblCellMar>
-            <w:top w:w="0" w:type="dxa"/>
-            <w:bottom w:w="0" w:type="dxa"/>
-          </w:tblCellMar>
-        </w:tblPrEx>
         <w:trPr>
           <w:tblHeader/>
         </w:trPr>
@@ -7947,12 +8762,6 @@
         </w:tc>
       </w:tr>
       <w:tr>
-        <w:tblPrEx>
-          <w:tblCellMar>
-            <w:top w:w="0" w:type="dxa"/>
-            <w:bottom w:w="0" w:type="dxa"/>
-          </w:tblCellMar>
-        </w:tblPrEx>
         <w:tc>
           <w:tcPr>
             <w:tcW w:w="5400" w:type="dxa"/>
@@ -7998,12 +8807,6 @@
         </w:tc>
       </w:tr>
       <w:tr>
-        <w:tblPrEx>
-          <w:tblCellMar>
-            <w:top w:w="0" w:type="dxa"/>
-            <w:bottom w:w="0" w:type="dxa"/>
-          </w:tblCellMar>
-        </w:tblPrEx>
         <w:tc>
           <w:tcPr>
             <w:tcW w:w="5400" w:type="dxa"/>
@@ -8051,12 +8854,6 @@
         </w:tc>
       </w:tr>
       <w:tr>
-        <w:tblPrEx>
-          <w:tblCellMar>
-            <w:top w:w="0" w:type="dxa"/>
-            <w:bottom w:w="0" w:type="dxa"/>
-          </w:tblCellMar>
-        </w:tblPrEx>
         <w:tc>
           <w:tcPr>
             <w:tcW w:w="5400" w:type="dxa"/>
@@ -8102,12 +8899,6 @@
         </w:tc>
       </w:tr>
       <w:tr>
-        <w:tblPrEx>
-          <w:tblCellMar>
-            <w:top w:w="0" w:type="dxa"/>
-            <w:bottom w:w="0" w:type="dxa"/>
-          </w:tblCellMar>
-        </w:tblPrEx>
         <w:tc>
           <w:tcPr>
             <w:tcW w:w="5400" w:type="dxa"/>
@@ -8155,12 +8946,6 @@
         </w:tc>
       </w:tr>
       <w:tr>
-        <w:tblPrEx>
-          <w:tblCellMar>
-            <w:top w:w="0" w:type="dxa"/>
-            <w:bottom w:w="0" w:type="dxa"/>
-          </w:tblCellMar>
-        </w:tblPrEx>
         <w:tc>
           <w:tcPr>
             <w:tcW w:w="5400" w:type="dxa"/>
@@ -8239,7 +9024,15 @@
         <w:jc w:val="both"/>
       </w:pPr>
       <w:r>
-        <w:t>El dataset cubre el periodo de enero a mayo de 2026. La serie mensual muestra los siguientes valores:</w:t>
+        <w:t xml:space="preserve">El </w:t>
+      </w:r>
+      <w:proofErr w:type="spellStart"/>
+      <w:r>
+        <w:t>dataset</w:t>
+      </w:r>
+      <w:proofErr w:type="spellEnd"/>
+      <w:r>
+        <w:t xml:space="preserve"> cubre el periodo de enero a mayo de 2026. La serie mensual muestra los siguientes valores:</w:t>
       </w:r>
     </w:p>
     <w:tbl>
@@ -8264,12 +9057,6 @@
         <w:gridCol w:w="3600"/>
       </w:tblGrid>
       <w:tr>
-        <w:tblPrEx>
-          <w:tblCellMar>
-            <w:top w:w="0" w:type="dxa"/>
-            <w:bottom w:w="0" w:type="dxa"/>
-          </w:tblCellMar>
-        </w:tblPrEx>
         <w:trPr>
           <w:tblHeader/>
         </w:trPr>
@@ -8329,12 +9116,6 @@
         </w:tc>
       </w:tr>
       <w:tr>
-        <w:tblPrEx>
-          <w:tblCellMar>
-            <w:top w:w="0" w:type="dxa"/>
-            <w:bottom w:w="0" w:type="dxa"/>
-          </w:tblCellMar>
-        </w:tblPrEx>
         <w:tc>
           <w:tcPr>
             <w:tcW w:w="5400" w:type="dxa"/>
@@ -8380,12 +9161,6 @@
         </w:tc>
       </w:tr>
       <w:tr>
-        <w:tblPrEx>
-          <w:tblCellMar>
-            <w:top w:w="0" w:type="dxa"/>
-            <w:bottom w:w="0" w:type="dxa"/>
-          </w:tblCellMar>
-        </w:tblPrEx>
         <w:tc>
           <w:tcPr>
             <w:tcW w:w="5400" w:type="dxa"/>
@@ -8433,12 +9208,6 @@
         </w:tc>
       </w:tr>
       <w:tr>
-        <w:tblPrEx>
-          <w:tblCellMar>
-            <w:top w:w="0" w:type="dxa"/>
-            <w:bottom w:w="0" w:type="dxa"/>
-          </w:tblCellMar>
-        </w:tblPrEx>
         <w:tc>
           <w:tcPr>
             <w:tcW w:w="5400" w:type="dxa"/>
@@ -8484,12 +9253,6 @@
         </w:tc>
       </w:tr>
       <w:tr>
-        <w:tblPrEx>
-          <w:tblCellMar>
-            <w:top w:w="0" w:type="dxa"/>
-            <w:bottom w:w="0" w:type="dxa"/>
-          </w:tblCellMar>
-        </w:tblPrEx>
         <w:tc>
           <w:tcPr>
             <w:tcW w:w="5400" w:type="dxa"/>
@@ -8537,12 +9300,6 @@
         </w:tc>
       </w:tr>
       <w:tr>
-        <w:tblPrEx>
-          <w:tblCellMar>
-            <w:top w:w="0" w:type="dxa"/>
-            <w:bottom w:w="0" w:type="dxa"/>
-          </w:tblCellMar>
-        </w:tblPrEx>
         <w:tc>
           <w:tcPr>
             <w:tcW w:w="5400" w:type="dxa"/>
@@ -8646,12 +9403,6 @@
         <w:gridCol w:w="3600"/>
       </w:tblGrid>
       <w:tr>
-        <w:tblPrEx>
-          <w:tblCellMar>
-            <w:top w:w="0" w:type="dxa"/>
-            <w:bottom w:w="0" w:type="dxa"/>
-          </w:tblCellMar>
-        </w:tblPrEx>
         <w:trPr>
           <w:tblHeader/>
         </w:trPr>
@@ -8711,12 +9462,6 @@
         </w:tc>
       </w:tr>
       <w:tr>
-        <w:tblPrEx>
-          <w:tblCellMar>
-            <w:top w:w="0" w:type="dxa"/>
-            <w:bottom w:w="0" w:type="dxa"/>
-          </w:tblCellMar>
-        </w:tblPrEx>
         <w:tc>
           <w:tcPr>
             <w:tcW w:w="5400" w:type="dxa"/>
@@ -8762,12 +9507,6 @@
         </w:tc>
       </w:tr>
       <w:tr>
-        <w:tblPrEx>
-          <w:tblCellMar>
-            <w:top w:w="0" w:type="dxa"/>
-            <w:bottom w:w="0" w:type="dxa"/>
-          </w:tblCellMar>
-        </w:tblPrEx>
         <w:tc>
           <w:tcPr>
             <w:tcW w:w="5400" w:type="dxa"/>
@@ -8815,12 +9554,6 @@
         </w:tc>
       </w:tr>
       <w:tr>
-        <w:tblPrEx>
-          <w:tblCellMar>
-            <w:top w:w="0" w:type="dxa"/>
-            <w:bottom w:w="0" w:type="dxa"/>
-          </w:tblCellMar>
-        </w:tblPrEx>
         <w:tc>
           <w:tcPr>
             <w:tcW w:w="5400" w:type="dxa"/>
@@ -8866,12 +9599,6 @@
         </w:tc>
       </w:tr>
       <w:tr>
-        <w:tblPrEx>
-          <w:tblCellMar>
-            <w:top w:w="0" w:type="dxa"/>
-            <w:bottom w:w="0" w:type="dxa"/>
-          </w:tblCellMar>
-        </w:tblPrEx>
         <w:tc>
           <w:tcPr>
             <w:tcW w:w="5400" w:type="dxa"/>
@@ -8919,12 +9646,6 @@
         </w:tc>
       </w:tr>
       <w:tr>
-        <w:tblPrEx>
-          <w:tblCellMar>
-            <w:top w:w="0" w:type="dxa"/>
-            <w:bottom w:w="0" w:type="dxa"/>
-          </w:tblCellMar>
-        </w:tblPrEx>
         <w:tc>
           <w:tcPr>
             <w:tcW w:w="5400" w:type="dxa"/>
@@ -8970,12 +9691,6 @@
         </w:tc>
       </w:tr>
       <w:tr>
-        <w:tblPrEx>
-          <w:tblCellMar>
-            <w:top w:w="0" w:type="dxa"/>
-            <w:bottom w:w="0" w:type="dxa"/>
-          </w:tblCellMar>
-        </w:tblPrEx>
         <w:tc>
           <w:tcPr>
             <w:tcW w:w="5400" w:type="dxa"/>
@@ -9046,6 +9761,7 @@
       </w:pPr>
       <w:bookmarkStart w:id="42" w:name="_Toc234523516"/>
       <w:r>
+        <w:lastRenderedPageBreak/>
         <w:t>Distribución por Perfil de Víctima</w:t>
       </w:r>
       <w:bookmarkEnd w:id="42"/>
@@ -9077,7 +9793,15 @@
         <w:jc w:val="both"/>
       </w:pPr>
       <w:r>
-        <w:t>Para complementar el análisis de volumen con una medida relativa a la población, se calculó la tasa de homicidios por cada 100.000 habitantes utilizando la población de Ecuador obtenida por la API pública del Banco Mundial (18.289.896 habitantes, año 2025). Como el dataset cubre únicamente el periodo enero–mayo 2026 (151 días), se reportan dos valores:</w:t>
+        <w:t xml:space="preserve">Para complementar el análisis de volumen con una medida relativa a la población, se calculó la tasa de homicidios por cada 100.000 habitantes utilizando la población de Ecuador obtenida por la API pública del Banco Mundial (18.289.896 habitantes, año 2025). Como el </w:t>
+      </w:r>
+      <w:proofErr w:type="spellStart"/>
+      <w:r>
+        <w:t>dataset</w:t>
+      </w:r>
+      <w:proofErr w:type="spellEnd"/>
+      <w:r>
+        <w:t xml:space="preserve"> cubre únicamente el periodo enero–mayo 2026 (151 días), se reportan dos valores:</w:t>
       </w:r>
     </w:p>
     <w:p>
@@ -9135,10 +9859,7 @@
         <w:jc w:val="both"/>
       </w:pPr>
       <w:r>
-        <w:t>Para identificar qué variables se mueven juntas se construyó, a nivel de provincia, un conjunto de indicadores numéricos (total de homicidios, porcentaje de arma de fuego, porcentaje de víctimas hombres, edad promedio, número de cantones afectados y homicidios del último mes) y se calculó su matriz de correlación de Pearson. El coeficiente de correlación (r) varía entre -1 y 1: valores cercanos a 1 indican asociación positiva fuerte, cercanos a -1 asociación negativa fuerte, y cercanos a 0 ausencia de relac</w:t>
-      </w:r>
-      <w:r>
-        <w:t>ión lineal. Las asociaciones más relevantes fueron:</w:t>
+        <w:t>Para identificar qué variables se mueven juntas se construyó, a nivel de provincia, un conjunto de indicadores numéricos (total de homicidios, porcentaje de arma de fuego, porcentaje de víctimas hombres, edad promedio, número de cantones afectados y homicidios del último mes) y se calculó su matriz de correlación de Pearson. El coeficiente de correlación (r) varía entre -1 y 1: valores cercanos a 1 indican asociación positiva fuerte, cercanos a -1 asociación negativa fuerte, y cercanos a 0 ausencia de relación lineal. Las asociaciones más relevantes fueron:</w:t>
       </w:r>
     </w:p>
     <w:tbl>
@@ -9164,12 +9885,6 @@
         <w:gridCol w:w="3100"/>
       </w:tblGrid>
       <w:tr>
-        <w:tblPrEx>
-          <w:tblCellMar>
-            <w:top w:w="0" w:type="dxa"/>
-            <w:bottom w:w="0" w:type="dxa"/>
-          </w:tblCellMar>
-        </w:tblPrEx>
         <w:trPr>
           <w:tblHeader/>
         </w:trPr>
@@ -9256,12 +9971,6 @@
         </w:tc>
       </w:tr>
       <w:tr>
-        <w:tblPrEx>
-          <w:tblCellMar>
-            <w:top w:w="0" w:type="dxa"/>
-            <w:bottom w:w="0" w:type="dxa"/>
-          </w:tblCellMar>
-        </w:tblPrEx>
         <w:tc>
           <w:tcPr>
             <w:tcW w:w="5000" w:type="dxa"/>
@@ -9273,12 +9982,21 @@
             </w:tcMar>
           </w:tcPr>
           <w:p>
-            <w:r>
-              <w:rPr>
-                <w:sz w:val="22"/>
-                <w:szCs w:val="22"/>
-              </w:rPr>
-              <w:t>Total de homicidios vs. homicidios del último mes</w:t>
+            <w:proofErr w:type="gramStart"/>
+            <w:r>
+              <w:rPr>
+                <w:sz w:val="22"/>
+                <w:szCs w:val="22"/>
+              </w:rPr>
+              <w:t>Total</w:t>
+            </w:r>
+            <w:proofErr w:type="gramEnd"/>
+            <w:r>
+              <w:rPr>
+                <w:sz w:val="22"/>
+                <w:szCs w:val="22"/>
+              </w:rPr>
+              <w:t xml:space="preserve"> de homicidios vs. homicidios del último mes</w:t>
             </w:r>
           </w:p>
         </w:tc>
@@ -9330,12 +10048,6 @@
         </w:tc>
       </w:tr>
       <w:tr>
-        <w:tblPrEx>
-          <w:tblCellMar>
-            <w:top w:w="0" w:type="dxa"/>
-            <w:bottom w:w="0" w:type="dxa"/>
-          </w:tblCellMar>
-        </w:tblPrEx>
         <w:tc>
           <w:tcPr>
             <w:tcW w:w="5000" w:type="dxa"/>
@@ -9348,12 +10060,21 @@
             </w:tcMar>
           </w:tcPr>
           <w:p>
-            <w:r>
-              <w:rPr>
-                <w:sz w:val="22"/>
-                <w:szCs w:val="22"/>
-              </w:rPr>
-              <w:t>Total de homicidios vs. cantones afectados</w:t>
+            <w:proofErr w:type="gramStart"/>
+            <w:r>
+              <w:rPr>
+                <w:sz w:val="22"/>
+                <w:szCs w:val="22"/>
+              </w:rPr>
+              <w:t>Total</w:t>
+            </w:r>
+            <w:proofErr w:type="gramEnd"/>
+            <w:r>
+              <w:rPr>
+                <w:sz w:val="22"/>
+                <w:szCs w:val="22"/>
+              </w:rPr>
+              <w:t xml:space="preserve"> de homicidios vs. cantones afectados</w:t>
             </w:r>
           </w:p>
         </w:tc>
@@ -9407,12 +10128,6 @@
         </w:tc>
       </w:tr>
       <w:tr>
-        <w:tblPrEx>
-          <w:tblCellMar>
-            <w:top w:w="0" w:type="dxa"/>
-            <w:bottom w:w="0" w:type="dxa"/>
-          </w:tblCellMar>
-        </w:tblPrEx>
         <w:tc>
           <w:tcPr>
             <w:tcW w:w="5000" w:type="dxa"/>
@@ -9424,12 +10139,21 @@
             </w:tcMar>
           </w:tcPr>
           <w:p>
-            <w:r>
-              <w:rPr>
-                <w:sz w:val="22"/>
-                <w:szCs w:val="22"/>
-              </w:rPr>
-              <w:t>Total de homicidios vs. % de arma de fuego</w:t>
+            <w:proofErr w:type="gramStart"/>
+            <w:r>
+              <w:rPr>
+                <w:sz w:val="22"/>
+                <w:szCs w:val="22"/>
+              </w:rPr>
+              <w:t>Total</w:t>
+            </w:r>
+            <w:proofErr w:type="gramEnd"/>
+            <w:r>
+              <w:rPr>
+                <w:sz w:val="22"/>
+                <w:szCs w:val="22"/>
+              </w:rPr>
+              <w:t xml:space="preserve"> de homicidios vs. % de arma de fuego</w:t>
             </w:r>
           </w:p>
         </w:tc>
@@ -9481,12 +10205,6 @@
         </w:tc>
       </w:tr>
       <w:tr>
-        <w:tblPrEx>
-          <w:tblCellMar>
-            <w:top w:w="0" w:type="dxa"/>
-            <w:bottom w:w="0" w:type="dxa"/>
-          </w:tblCellMar>
-        </w:tblPrEx>
         <w:tc>
           <w:tcPr>
             <w:tcW w:w="5000" w:type="dxa"/>
@@ -9570,10 +10288,23 @@
         <w:jc w:val="both"/>
       </w:pPr>
       <w:r>
-        <w:t>Estas correlaciones aportan lecturas útiles: las provincias con mayor volumen histórico tienden a mantener alta incidencia reciente (r = 0,99) y a extender el problema a más cantones (r = 0,91), lo que respalda el uso del índice de riesgo territorial. La correlación negativa entre el porcentaje de arma de fuego y la edad promedio (r = -0,49) sugiere que, en los territorios donde predomina el arma de fuego, las víctimas tienden a ser más jóvenes. La matriz completa se guarda en reports/correlacion_provincias</w:t>
-      </w:r>
-      <w:r>
-        <w:t>.csv y se visualiza como mapa de calor en el dashboard.</w:t>
+        <w:t xml:space="preserve">Estas correlaciones aportan lecturas útiles: las provincias con mayor volumen histórico tienden a mantener alta incidencia reciente (r = 0,99) y a extender el problema a más cantones (r = 0,91), lo que respalda el uso del índice de riesgo territorial. La correlación negativa entre el porcentaje de arma de fuego y la edad promedio (r = -0,49) sugiere que, en los territorios donde predomina el arma de fuego, las víctimas tienden a ser más jóvenes. La matriz completa se guarda en </w:t>
+      </w:r>
+      <w:proofErr w:type="spellStart"/>
+      <w:r>
+        <w:t>reports</w:t>
+      </w:r>
+      <w:proofErr w:type="spellEnd"/>
+      <w:r>
+        <w:t xml:space="preserve">/correlacion_provincias.csv y se visualiza como mapa de calor en el </w:t>
+      </w:r>
+      <w:proofErr w:type="spellStart"/>
+      <w:r>
+        <w:t>dashboard</w:t>
+      </w:r>
+      <w:proofErr w:type="spellEnd"/>
+      <w:r>
+        <w:t>.</w:t>
       </w:r>
     </w:p>
     <w:p>
@@ -9594,10 +10325,27 @@
         <w:jc w:val="both"/>
       </w:pPr>
       <w:r>
-        <w:t>Es fundamental subrayar que la correlación describe asociación, no causalidad. Que dos variables se muevan juntas no implica que una cause la otra. Por ejemplo, que una provincia registre mayor número de casos no significa que el territorio sea la causa directa del delito: puede existir influencia de factores externos no incluidos en el dataset, como densidad poblacional, dinámicas criminales, movilidad, capacidad de denuncia, operativos policiales o subregistro. Por esta razón, el dashboard se presenta com</w:t>
-      </w:r>
-      <w:r>
-        <w:t>o herramienta de apoyo a la decisión y no como mecanismo de determinación causal.</w:t>
+        <w:t xml:space="preserve">Es fundamental subrayar que la correlación describe asociación, no causalidad. Que dos variables se muevan juntas no implica que una cause la otra. Por ejemplo, que una provincia registre mayor número de casos no significa que el territorio sea la causa directa del delito: puede existir influencia </w:t>
+      </w:r>
+      <w:r>
+        <w:lastRenderedPageBreak/>
+        <w:t xml:space="preserve">de factores externos no incluidos en el </w:t>
+      </w:r>
+      <w:proofErr w:type="spellStart"/>
+      <w:r>
+        <w:t>dataset</w:t>
+      </w:r>
+      <w:proofErr w:type="spellEnd"/>
+      <w:r>
+        <w:t xml:space="preserve">, como densidad poblacional, dinámicas criminales, movilidad, capacidad de denuncia, operativos policiales o subregistro. Por esta razón, el </w:t>
+      </w:r>
+      <w:proofErr w:type="spellStart"/>
+      <w:r>
+        <w:t>dashboard</w:t>
+      </w:r>
+      <w:proofErr w:type="spellEnd"/>
+      <w:r>
+        <w:t xml:space="preserve"> se presenta como herramienta de apoyo a la decisión y no como mecanismo de determinación causal.</w:t>
       </w:r>
     </w:p>
     <w:p>
@@ -9608,7 +10356,15 @@
       </w:pPr>
       <w:bookmarkStart w:id="46" w:name="_Toc234523520"/>
       <w:r>
-        <w:t>3.2. Diseño de Indicadores (KPIs)</w:t>
+        <w:t>3.2. Diseño de Indicadores (</w:t>
+      </w:r>
+      <w:proofErr w:type="spellStart"/>
+      <w:r>
+        <w:t>KPIs</w:t>
+      </w:r>
+      <w:proofErr w:type="spellEnd"/>
+      <w:r>
+        <w:t>)</w:t>
       </w:r>
       <w:bookmarkEnd w:id="46"/>
     </w:p>
@@ -9618,7 +10374,15 @@
         <w:jc w:val="both"/>
       </w:pPr>
       <w:r>
-        <w:t>Se diseñaron indicadores ejecutivos para responder a los objetivos de analítica definidos en la Fase 1. Estos KPIs permiten monitorear la incidencia, caracterizar el fenómeno y priorizar territorios.</w:t>
+        <w:t xml:space="preserve">Se diseñaron indicadores ejecutivos para responder a los objetivos de analítica definidos en la Fase 1. Estos </w:t>
+      </w:r>
+      <w:proofErr w:type="spellStart"/>
+      <w:r>
+        <w:t>KPIs</w:t>
+      </w:r>
+      <w:proofErr w:type="spellEnd"/>
+      <w:r>
+        <w:t xml:space="preserve"> permiten monitorear la incidencia, caracterizar el fenómeno y priorizar territorios.</w:t>
       </w:r>
     </w:p>
     <w:tbl>
@@ -9644,12 +10408,6 @@
         <w:gridCol w:w="2600"/>
       </w:tblGrid>
       <w:tr>
-        <w:tblPrEx>
-          <w:tblCellMar>
-            <w:top w:w="0" w:type="dxa"/>
-            <w:bottom w:w="0" w:type="dxa"/>
-          </w:tblCellMar>
-        </w:tblPrEx>
         <w:trPr>
           <w:tblHeader/>
         </w:trPr>
@@ -9736,12 +10494,6 @@
         </w:tc>
       </w:tr>
       <w:tr>
-        <w:tblPrEx>
-          <w:tblCellMar>
-            <w:top w:w="0" w:type="dxa"/>
-            <w:bottom w:w="0" w:type="dxa"/>
-          </w:tblCellMar>
-        </w:tblPrEx>
         <w:tc>
           <w:tcPr>
             <w:tcW w:w="4600" w:type="dxa"/>
@@ -9753,12 +10505,21 @@
             </w:tcMar>
           </w:tcPr>
           <w:p>
-            <w:r>
-              <w:rPr>
-                <w:sz w:val="22"/>
-                <w:szCs w:val="22"/>
-              </w:rPr>
-              <w:t>Total de homicidios intencionales</w:t>
+            <w:proofErr w:type="gramStart"/>
+            <w:r>
+              <w:rPr>
+                <w:sz w:val="22"/>
+                <w:szCs w:val="22"/>
+              </w:rPr>
+              <w:t>Total</w:t>
+            </w:r>
+            <w:proofErr w:type="gramEnd"/>
+            <w:r>
+              <w:rPr>
+                <w:sz w:val="22"/>
+                <w:szCs w:val="22"/>
+              </w:rPr>
+              <w:t xml:space="preserve"> de homicidios intencionales</w:t>
             </w:r>
           </w:p>
         </w:tc>
@@ -9810,12 +10571,6 @@
         </w:tc>
       </w:tr>
       <w:tr>
-        <w:tblPrEx>
-          <w:tblCellMar>
-            <w:top w:w="0" w:type="dxa"/>
-            <w:bottom w:w="0" w:type="dxa"/>
-          </w:tblCellMar>
-        </w:tblPrEx>
         <w:tc>
           <w:tcPr>
             <w:tcW w:w="4600" w:type="dxa"/>
@@ -9887,12 +10642,6 @@
         </w:tc>
       </w:tr>
       <w:tr>
-        <w:tblPrEx>
-          <w:tblCellMar>
-            <w:top w:w="0" w:type="dxa"/>
-            <w:bottom w:w="0" w:type="dxa"/>
-          </w:tblCellMar>
-        </w:tblPrEx>
         <w:tc>
           <w:tcPr>
             <w:tcW w:w="4600" w:type="dxa"/>
@@ -9961,12 +10710,6 @@
         </w:tc>
       </w:tr>
       <w:tr>
-        <w:tblPrEx>
-          <w:tblCellMar>
-            <w:top w:w="0" w:type="dxa"/>
-            <w:bottom w:w="0" w:type="dxa"/>
-          </w:tblCellMar>
-        </w:tblPrEx>
         <w:tc>
           <w:tcPr>
             <w:tcW w:w="4600" w:type="dxa"/>
@@ -10038,12 +10781,6 @@
         </w:tc>
       </w:tr>
       <w:tr>
-        <w:tblPrEx>
-          <w:tblCellMar>
-            <w:top w:w="0" w:type="dxa"/>
-            <w:bottom w:w="0" w:type="dxa"/>
-          </w:tblCellMar>
-        </w:tblPrEx>
         <w:tc>
           <w:tcPr>
             <w:tcW w:w="4600" w:type="dxa"/>
@@ -10112,12 +10849,6 @@
         </w:tc>
       </w:tr>
       <w:tr>
-        <w:tblPrEx>
-          <w:tblCellMar>
-            <w:top w:w="0" w:type="dxa"/>
-            <w:bottom w:w="0" w:type="dxa"/>
-          </w:tblCellMar>
-        </w:tblPrEx>
         <w:tc>
           <w:tcPr>
             <w:tcW w:w="4600" w:type="dxa"/>
@@ -10189,12 +10920,6 @@
         </w:tc>
       </w:tr>
       <w:tr>
-        <w:tblPrEx>
-          <w:tblCellMar>
-            <w:top w:w="0" w:type="dxa"/>
-            <w:bottom w:w="0" w:type="dxa"/>
-          </w:tblCellMar>
-        </w:tblPrEx>
         <w:tc>
           <w:tcPr>
             <w:tcW w:w="4600" w:type="dxa"/>
@@ -10263,12 +10988,6 @@
         </w:tc>
       </w:tr>
       <w:tr>
-        <w:tblPrEx>
-          <w:tblCellMar>
-            <w:top w:w="0" w:type="dxa"/>
-            <w:bottom w:w="0" w:type="dxa"/>
-          </w:tblCellMar>
-        </w:tblPrEx>
         <w:tc>
           <w:tcPr>
             <w:tcW w:w="4600" w:type="dxa"/>
@@ -10363,9 +11082,22 @@
       </w:pPr>
       <w:bookmarkStart w:id="47" w:name="_Toc234523521"/>
       <w:r>
-        <w:t>3.3. Dashboard Estratégico y Storytelling</w:t>
+        <w:t xml:space="preserve">3.3. </w:t>
+      </w:r>
+      <w:proofErr w:type="spellStart"/>
+      <w:r>
+        <w:t>Dashboard</w:t>
+      </w:r>
+      <w:proofErr w:type="spellEnd"/>
+      <w:r>
+        <w:t xml:space="preserve"> Estratégico y </w:t>
+      </w:r>
+      <w:proofErr w:type="spellStart"/>
+      <w:r>
+        <w:t>Storytelling</w:t>
       </w:r>
       <w:bookmarkEnd w:id="47"/>
+      <w:proofErr w:type="spellEnd"/>
     </w:p>
     <w:p>
       <w:pPr>
@@ -10373,7 +11105,71 @@
         <w:jc w:val="both"/>
       </w:pPr>
       <w:r>
-        <w:t>El dashboard estratégico fue desarrollado en dos frentes complementarios: un dashboard en Power BI, contenido en el archivo Dashboards de criminalistica de homicidios.pbix.zip, y un dashboard web interactivo en Streamlit, ejecutado desde dashboard/app.py. La versión Streamlit permite una experiencia ejecutiva reproducible con filtros, visualizaciones, alertas, riesgo territorial y simulador.</w:t>
+        <w:t xml:space="preserve">El </w:t>
+      </w:r>
+      <w:proofErr w:type="spellStart"/>
+      <w:r>
+        <w:t>dashboard</w:t>
+      </w:r>
+      <w:proofErr w:type="spellEnd"/>
+      <w:r>
+        <w:t xml:space="preserve"> estratégico fue desarrollado en dos frentes complementarios: un </w:t>
+      </w:r>
+      <w:proofErr w:type="spellStart"/>
+      <w:r>
+        <w:t>dashboard</w:t>
+      </w:r>
+      <w:proofErr w:type="spellEnd"/>
+      <w:r>
+        <w:t xml:space="preserve"> en Power BI, contenido en el archivo </w:t>
+      </w:r>
+      <w:proofErr w:type="spellStart"/>
+      <w:r>
+        <w:t>Dashboards</w:t>
+      </w:r>
+      <w:proofErr w:type="spellEnd"/>
+      <w:r>
+        <w:t xml:space="preserve"> de </w:t>
+      </w:r>
+      <w:proofErr w:type="spellStart"/>
+      <w:r>
+        <w:t>criminalistica</w:t>
+      </w:r>
+      <w:proofErr w:type="spellEnd"/>
+      <w:r>
+        <w:t xml:space="preserve"> de homicidios.pbix.zip, y un </w:t>
+      </w:r>
+      <w:proofErr w:type="spellStart"/>
+      <w:r>
+        <w:t>dashboard</w:t>
+      </w:r>
+      <w:proofErr w:type="spellEnd"/>
+      <w:r>
+        <w:t xml:space="preserve"> web interactivo en </w:t>
+      </w:r>
+      <w:proofErr w:type="spellStart"/>
+      <w:r>
+        <w:t>Streamlit</w:t>
+      </w:r>
+      <w:proofErr w:type="spellEnd"/>
+      <w:r>
+        <w:t xml:space="preserve">, ejecutado desde </w:t>
+      </w:r>
+      <w:proofErr w:type="spellStart"/>
+      <w:r>
+        <w:t>dashboard</w:t>
+      </w:r>
+      <w:proofErr w:type="spellEnd"/>
+      <w:r>
+        <w:t xml:space="preserve">/app.py. La versión </w:t>
+      </w:r>
+      <w:proofErr w:type="spellStart"/>
+      <w:r>
+        <w:t>Streamlit</w:t>
+      </w:r>
+      <w:proofErr w:type="spellEnd"/>
+      <w:r>
+        <w:t xml:space="preserve"> permite una experiencia ejecutiva reproducible con filtros, visualizaciones, alertas, riesgo territorial y simulador.</w:t>
       </w:r>
     </w:p>
     <w:p>
@@ -10384,9 +11180,14 @@
       </w:pPr>
       <w:bookmarkStart w:id="48" w:name="_Toc234523522"/>
       <w:r>
-        <w:t>Estructura del Dashboard</w:t>
+        <w:t xml:space="preserve">Estructura del </w:t>
+      </w:r>
+      <w:proofErr w:type="spellStart"/>
+      <w:r>
+        <w:t>Dashboard</w:t>
       </w:r>
       <w:bookmarkEnd w:id="48"/>
+      <w:proofErr w:type="spellEnd"/>
     </w:p>
     <w:p>
       <w:pPr>
@@ -10399,7 +11200,15 @@
         <w:jc w:val="both"/>
       </w:pPr>
       <w:r>
-        <w:t>Ejecutivo: KPIs principales, evolución mensual, provincias críticas y prioridades estratégicas.</w:t>
+        <w:t xml:space="preserve">Ejecutivo: </w:t>
+      </w:r>
+      <w:proofErr w:type="spellStart"/>
+      <w:r>
+        <w:t>KPIs</w:t>
+      </w:r>
+      <w:proofErr w:type="spellEnd"/>
+      <w:r>
+        <w:t xml:space="preserve"> principales, evolución mensual, provincias críticas y prioridades estratégicas.</w:t>
       </w:r>
     </w:p>
     <w:p>
@@ -10507,8 +11316,13 @@
         <w:spacing w:line="276" w:lineRule="auto"/>
       </w:pPr>
       <w:bookmarkStart w:id="49" w:name="_Toc234523523"/>
-      <w:r>
-        <w:t>Storytelling Ejecutivo</w:t>
+      <w:proofErr w:type="spellStart"/>
+      <w:r>
+        <w:t>Storytelling</w:t>
+      </w:r>
+      <w:proofErr w:type="spellEnd"/>
+      <w:r>
+        <w:t xml:space="preserve"> Ejecutivo</w:t>
       </w:r>
       <w:bookmarkEnd w:id="49"/>
     </w:p>
@@ -10518,10 +11332,35 @@
         <w:jc w:val="both"/>
       </w:pPr>
       <w:r>
-        <w:t xml:space="preserve">El storytelling del dashboard sigue una secuencia orientada a la toma de decisiones: (1) magnitud del problema mediante KPIs generales; (2) concentración territorial identificando provincias y cantones críticos; (3) patrones temporales por horario, día y evolución mensual; (4) caracterización del delito por armas, motivaciones, lugares y perfil de víctimas; (5) priorización mediante el índice de riesgo territorial; y (6) acción, con alertas, recomendaciones y simulador de escenarios. Este flujo permite que </w:t>
-      </w:r>
-      <w:r>
-        <w:t>un usuario ejecutivo pase de observar datos a identificar prioridades y posibles acciones.</w:t>
+        <w:t xml:space="preserve">El </w:t>
+      </w:r>
+      <w:proofErr w:type="spellStart"/>
+      <w:r>
+        <w:t>storytelling</w:t>
+      </w:r>
+      <w:proofErr w:type="spellEnd"/>
+      <w:r>
+        <w:t xml:space="preserve"> del </w:t>
+      </w:r>
+      <w:proofErr w:type="spellStart"/>
+      <w:r>
+        <w:t>dashboard</w:t>
+      </w:r>
+      <w:proofErr w:type="spellEnd"/>
+      <w:r>
+        <w:t xml:space="preserve"> sigue una secuencia orientada a la toma de decisiones: (1) magnitud del problema mediante </w:t>
+      </w:r>
+      <w:proofErr w:type="spellStart"/>
+      <w:r>
+        <w:t>KPIs</w:t>
+      </w:r>
+      <w:proofErr w:type="spellEnd"/>
+      <w:r>
+        <w:t xml:space="preserve"> generales; (2) concentración territorial identificando provincias y cantones críticos; (3) patrones temporales por horario, día y evolución mensual; (4) caracterización del delito </w:t>
+      </w:r>
+      <w:r>
+        <w:lastRenderedPageBreak/>
+        <w:t>por armas, motivaciones, lugares y perfil de víctimas; (5) priorización mediante el índice de riesgo territorial; y (6) acción, con alertas, recomendaciones y simulador de escenarios. Este flujo permite que un usuario ejecutivo pase de observar datos a identificar prioridades y posibles acciones.</w:t>
       </w:r>
     </w:p>
     <w:p>
@@ -10547,7 +11386,15 @@
         <w:jc w:val="both"/>
       </w:pPr>
       <w:r>
-        <w:t>Jerarquía visual: los KPIs aparecen primero para resumir el estado general.</w:t>
+        <w:t xml:space="preserve">Jerarquía visual: los </w:t>
+      </w:r>
+      <w:proofErr w:type="spellStart"/>
+      <w:r>
+        <w:t>KPIs</w:t>
+      </w:r>
+      <w:proofErr w:type="spellEnd"/>
+      <w:r>
+        <w:t xml:space="preserve"> aparecen primero para resumir el estado general.</w:t>
       </w:r>
     </w:p>
     <w:p>
@@ -10647,7 +11494,23 @@
         <w:jc w:val="both"/>
       </w:pPr>
       <w:r>
-        <w:t>Se utiliza una tipografía sans-serif de lectura clara, con jerarquías por tamaño y peso. Los títulos, KPIs y etiquetas se diferencian visualmente para permitir lectura rápida en entornos ejecutivos.</w:t>
+        <w:t xml:space="preserve">Se utiliza una tipografía </w:t>
+      </w:r>
+      <w:proofErr w:type="spellStart"/>
+      <w:r>
+        <w:t>sans-serif</w:t>
+      </w:r>
+      <w:proofErr w:type="spellEnd"/>
+      <w:r>
+        <w:t xml:space="preserve"> de lectura clara, con jerarquías por tamaño y peso. Los títulos, </w:t>
+      </w:r>
+      <w:proofErr w:type="spellStart"/>
+      <w:r>
+        <w:t>KPIs</w:t>
+      </w:r>
+      <w:proofErr w:type="spellEnd"/>
+      <w:r>
+        <w:t xml:space="preserve"> y etiquetas se diferencian visualmente para permitir lectura rápida en entornos ejecutivos.</w:t>
       </w:r>
     </w:p>
     <w:p>
@@ -10707,7 +11570,23 @@
         <w:jc w:val="both"/>
       </w:pPr>
       <w:r>
-        <w:t>La Fase 3 permitió convertir el modelo de datos en información visual y estratégica. El análisis exploratorio identificó patrones relevantes de concentración territorial, predominio de arma de fuego, perfil de víctimas y comportamiento temporal. Los KPIs y el dashboard facilitan el monitoreo ejecutivo y convierten los datos en insumos accionables para la toma de decisiones.</w:t>
+        <w:t xml:space="preserve">La Fase 3 permitió convertir el modelo de datos en información visual y estratégica. El análisis exploratorio identificó patrones relevantes de concentración territorial, predominio de arma de fuego, perfil de víctimas y comportamiento temporal. Los </w:t>
+      </w:r>
+      <w:proofErr w:type="spellStart"/>
+      <w:r>
+        <w:t>KPIs</w:t>
+      </w:r>
+      <w:proofErr w:type="spellEnd"/>
+      <w:r>
+        <w:t xml:space="preserve"> y el </w:t>
+      </w:r>
+      <w:proofErr w:type="spellStart"/>
+      <w:r>
+        <w:t>dashboard</w:t>
+      </w:r>
+      <w:proofErr w:type="spellEnd"/>
+      <w:r>
+        <w:t xml:space="preserve"> facilitan el monitoreo ejecutivo y convierten los datos en insumos accionables para la toma de decisiones.</w:t>
       </w:r>
     </w:p>
     <w:p>
@@ -10730,7 +11609,15 @@
       </w:pPr>
       <w:bookmarkStart w:id="55" w:name="_Toc234523529"/>
       <w:r>
-        <w:t>4.1. Modelado Predictivo (Machine Learning)</w:t>
+        <w:t xml:space="preserve">4.1. Modelado Predictivo (Machine </w:t>
+      </w:r>
+      <w:proofErr w:type="spellStart"/>
+      <w:r>
+        <w:t>Learning</w:t>
+      </w:r>
+      <w:proofErr w:type="spellEnd"/>
+      <w:r>
+        <w:t>)</w:t>
       </w:r>
       <w:bookmarkEnd w:id="55"/>
     </w:p>
@@ -10740,7 +11627,27 @@
         <w:jc w:val="both"/>
       </w:pPr>
       <w:r>
-        <w:t>La fase predictiva de SafeAnalytics EC tiene como objetivo estimar señales de incidencia diaria por provincia y apoyar la priorización estratégica de territorios. Debido a que el dataset cubre únicamente cinco meses de 2026, el modelo se interpreta como un componente exploratorio de apoyo a la decisión y no como un pronóstico definitivo.</w:t>
+        <w:t xml:space="preserve">La fase predictiva de </w:t>
+      </w:r>
+      <w:proofErr w:type="spellStart"/>
+      <w:r>
+        <w:t>SafeAnalytics</w:t>
+      </w:r>
+      <w:proofErr w:type="spellEnd"/>
+      <w:r>
+        <w:t xml:space="preserve"> EC tiene como objetivo estimar señales de incidencia diaria por provincia y apoyar la priorización estratégica de territorios. Debido a que el </w:t>
+      </w:r>
+      <w:proofErr w:type="spellStart"/>
+      <w:r>
+        <w:t>dataset</w:t>
+      </w:r>
+      <w:proofErr w:type="spellEnd"/>
+      <w:r>
+        <w:t xml:space="preserve"> cubre únicamente </w:t>
+      </w:r>
+      <w:r>
+        <w:lastRenderedPageBreak/>
+        <w:t>cinco meses de 2026, el modelo se interpreta como un componente exploratorio de apoyo a la decisión y no como un pronóstico definitivo.</w:t>
       </w:r>
     </w:p>
     <w:p>
@@ -10771,8 +11678,13 @@
         <w:spacing w:line="276" w:lineRule="auto"/>
       </w:pPr>
       <w:bookmarkStart w:id="57" w:name="_Toc234523531"/>
-      <w:r>
-        <w:t>Dataset de Modelado</w:t>
+      <w:proofErr w:type="spellStart"/>
+      <w:r>
+        <w:t>Dataset</w:t>
+      </w:r>
+      <w:proofErr w:type="spellEnd"/>
+      <w:r>
+        <w:t xml:space="preserve"> de Modelado</w:t>
       </w:r>
       <w:bookmarkEnd w:id="57"/>
     </w:p>
@@ -10782,7 +11694,31 @@
         <w:jc w:val="both"/>
       </w:pPr>
       <w:r>
-        <w:t>El dataset utilizado para modelado se construyó a partir de fact_homicidios.csv y dim_geografia.csv. El script responsable es src/models/entrenar_modelo.py y el dataset final se guarda en data/processed/dataset_modelo_diario.csv. Las variables consideradas fueron provincia, fecha de infracción, mes, día de semana y total diario de homicidios. El modelo agrupa los registros a nivel diario por provincia, construyendo una base temporal para estimar incidencia esperada.</w:t>
+        <w:t xml:space="preserve">El </w:t>
+      </w:r>
+      <w:proofErr w:type="spellStart"/>
+      <w:r>
+        <w:t>dataset</w:t>
+      </w:r>
+      <w:proofErr w:type="spellEnd"/>
+      <w:r>
+        <w:t xml:space="preserve"> utilizado para modelado se construyó a partir de fact_homicidios.csv y dim_geografia.csv. El script responsable es src/models/entrenar_modelo.py y el </w:t>
+      </w:r>
+      <w:proofErr w:type="spellStart"/>
+      <w:r>
+        <w:t>dataset</w:t>
+      </w:r>
+      <w:proofErr w:type="spellEnd"/>
+      <w:r>
+        <w:t xml:space="preserve"> final se guarda en data/</w:t>
+      </w:r>
+      <w:proofErr w:type="spellStart"/>
+      <w:r>
+        <w:t>processed</w:t>
+      </w:r>
+      <w:proofErr w:type="spellEnd"/>
+      <w:r>
+        <w:t>/dataset_modelo_diario.csv. Las variables consideradas fueron provincia, fecha de infracción, mes, día de semana y total diario de homicidios. El modelo agrupa los registros a nivel diario por provincia, construyendo una base temporal para estimar incidencia esperada.</w:t>
       </w:r>
     </w:p>
     <w:p>
@@ -10812,7 +11748,15 @@
         <w:jc w:val="both"/>
       </w:pPr>
       <w:r>
-        <w:t>Modelo 1 — Baseline provincial explicable: ajustado por promedio histórico por provincia, factor por día de semana y tendencia reciente. La fórmula conceptual es:</w:t>
+        <w:t xml:space="preserve">Modelo 1 — </w:t>
+      </w:r>
+      <w:proofErr w:type="spellStart"/>
+      <w:r>
+        <w:t>Baseline</w:t>
+      </w:r>
+      <w:proofErr w:type="spellEnd"/>
+      <w:r>
+        <w:t xml:space="preserve"> provincial explicable: ajustado por promedio histórico por provincia, factor por día de semana y tendencia reciente. La fórmula conceptual es:</w:t>
       </w:r>
     </w:p>
     <w:p>
@@ -10835,7 +11779,39 @@
         <w:jc w:val="both"/>
       </w:pPr>
       <w:r>
-        <w:t>Modelo 2 — Regresión Lineal (scikit-learn): algoritmo clásico de aprendizaje supervisado, implementado con un pipeline que codifica la provincia y el día de semana (One-Hot Encoding) e incorpora el mes y una tendencia temporal como variables numéricas. Este modelo aporta la métrica R² y actúa como línea de comparación frente al baseline.</w:t>
+        <w:t>Modelo 2 — Regresión Lineal (</w:t>
+      </w:r>
+      <w:proofErr w:type="spellStart"/>
+      <w:r>
+        <w:t>scikit-learn</w:t>
+      </w:r>
+      <w:proofErr w:type="spellEnd"/>
+      <w:r>
+        <w:t>): algoritmo clásico de aprendizaje supervisado, implementado con un pipeline que codifica la provincia y el día de semana (</w:t>
+      </w:r>
+      <w:proofErr w:type="spellStart"/>
+      <w:r>
+        <w:t>One</w:t>
+      </w:r>
+      <w:proofErr w:type="spellEnd"/>
+      <w:r>
+        <w:t xml:space="preserve">-Hot </w:t>
+      </w:r>
+      <w:proofErr w:type="spellStart"/>
+      <w:r>
+        <w:t>Encoding</w:t>
+      </w:r>
+      <w:proofErr w:type="spellEnd"/>
+      <w:r>
+        <w:t xml:space="preserve">) e incorpora el mes y una tendencia temporal como variables numéricas. Este modelo aporta la métrica R² y actúa como línea de comparación frente al </w:t>
+      </w:r>
+      <w:proofErr w:type="spellStart"/>
+      <w:r>
+        <w:t>baseline</w:t>
+      </w:r>
+      <w:proofErr w:type="spellEnd"/>
+      <w:r>
+        <w:t>.</w:t>
       </w:r>
     </w:p>
     <w:p>
@@ -10883,12 +11859,6 @@
         <w:gridCol w:w="1400"/>
       </w:tblGrid>
       <w:tr>
-        <w:tblPrEx>
-          <w:tblCellMar>
-            <w:top w:w="0" w:type="dxa"/>
-            <w:bottom w:w="0" w:type="dxa"/>
-          </w:tblCellMar>
-        </w:tblPrEx>
         <w:trPr>
           <w:tblHeader/>
         </w:trPr>
@@ -11002,12 +11972,6 @@
         </w:tc>
       </w:tr>
       <w:tr>
-        <w:tblPrEx>
-          <w:tblCellMar>
-            <w:top w:w="0" w:type="dxa"/>
-            <w:bottom w:w="0" w:type="dxa"/>
-          </w:tblCellMar>
-        </w:tblPrEx>
         <w:tc>
           <w:tcPr>
             <w:tcW w:w="4400" w:type="dxa"/>
@@ -11019,12 +11983,21 @@
             </w:tcMar>
           </w:tcPr>
           <w:p>
-            <w:r>
-              <w:rPr>
-                <w:sz w:val="22"/>
-                <w:szCs w:val="22"/>
-              </w:rPr>
-              <w:t>Baseline provincial</w:t>
+            <w:proofErr w:type="spellStart"/>
+            <w:r>
+              <w:rPr>
+                <w:sz w:val="22"/>
+                <w:szCs w:val="22"/>
+              </w:rPr>
+              <w:t>Baseline</w:t>
+            </w:r>
+            <w:proofErr w:type="spellEnd"/>
+            <w:r>
+              <w:rPr>
+                <w:sz w:val="22"/>
+                <w:szCs w:val="22"/>
+              </w:rPr>
+              <w:t xml:space="preserve"> provincial</w:t>
             </w:r>
           </w:p>
         </w:tc>
@@ -11099,12 +12072,6 @@
         </w:tc>
       </w:tr>
       <w:tr>
-        <w:tblPrEx>
-          <w:tblCellMar>
-            <w:top w:w="0" w:type="dxa"/>
-            <w:bottom w:w="0" w:type="dxa"/>
-          </w:tblCellMar>
-        </w:tblPrEx>
         <w:tc>
           <w:tcPr>
             <w:tcW w:w="4400" w:type="dxa"/>
@@ -11122,7 +12089,23 @@
                 <w:sz w:val="22"/>
                 <w:szCs w:val="22"/>
               </w:rPr>
-              <w:t>Regresión Lineal (scikit-learn)</w:t>
+              <w:t>Regresión Lineal (</w:t>
+            </w:r>
+            <w:proofErr w:type="spellStart"/>
+            <w:r>
+              <w:rPr>
+                <w:sz w:val="22"/>
+                <w:szCs w:val="22"/>
+              </w:rPr>
+              <w:t>scikit-learn</w:t>
+            </w:r>
+            <w:proofErr w:type="spellEnd"/>
+            <w:r>
+              <w:rPr>
+                <w:sz w:val="22"/>
+                <w:szCs w:val="22"/>
+              </w:rPr>
+              <w:t>)</w:t>
             </w:r>
           </w:p>
         </w:tc>
@@ -11221,7 +12204,35 @@
         <w:jc w:val="both"/>
       </w:pPr>
       <w:r>
-        <w:t>El hallazgo más relevante de la comparación es que la Regresión Lineal obtiene un desempeño prácticamente idéntico al baseline (R² 0,532 frente a 0,533). Esto confirma, de forma empírica, que incorporar un algoritmo más estándar no mejora la predicción con los datos disponibles. Por esta razón se mantiene el baseline como modelo desplegado: entrega el mismo poder predictivo con mayor explicabilidad y transparencia, cualidades esenciales en el ámbito de la seguridad ciudadana.</w:t>
+        <w:t xml:space="preserve">El hallazgo más relevante de la comparación es que la Regresión Lineal obtiene un desempeño prácticamente idéntico al </w:t>
+      </w:r>
+      <w:proofErr w:type="spellStart"/>
+      <w:r>
+        <w:t>baseline</w:t>
+      </w:r>
+      <w:proofErr w:type="spellEnd"/>
+      <w:r>
+        <w:t xml:space="preserve"> (R² 0,532 frente a 0,533). Esto confirma, de forma empírica, que incorporar un algoritmo más estándar no mejora la predicción con los datos disponibles. Por esta </w:t>
+      </w:r>
+      <w:r>
+        <w:lastRenderedPageBreak/>
+        <w:t xml:space="preserve">razón se mantiene el </w:t>
+      </w:r>
+      <w:proofErr w:type="spellStart"/>
+      <w:r>
+        <w:t>baseline</w:t>
+      </w:r>
+      <w:proofErr w:type="spellEnd"/>
+      <w:r>
+        <w:t xml:space="preserve"> como modelo desplegado: entrega el mismo poder predictivo con mayor </w:t>
+      </w:r>
+      <w:proofErr w:type="spellStart"/>
+      <w:r>
+        <w:t>explicabilidad</w:t>
+      </w:r>
+      <w:proofErr w:type="spellEnd"/>
+      <w:r>
+        <w:t xml:space="preserve"> y transparencia, cualidades esenciales en el ámbito de la seguridad ciudadana.</w:t>
       </w:r>
     </w:p>
     <w:p>
@@ -11242,10 +12253,55 @@
         <w:jc w:val="both"/>
       </w:pPr>
       <w:r>
-        <w:t xml:space="preserve">El entrenamiento genera models/modelo_incidencia_diaria.pkl, reports/modelo_resultados.json y reports/predicciones_prueba.csv, lo que permite auditar el desempeño y reutilizar el modelo. Entre sus limitaciones: el dataset cubre solo cinco meses; no incorpora variables externas como población, operativos policiales, denuncias, movilidad o contexto socioeconómico; no debe interpretarse como causalidad; y no debe utilizarse para decisiones automatizadas sobre personas o grupos. Su función principal es generar </w:t>
-      </w:r>
-      <w:r>
-        <w:t>señales de priorización territorial.</w:t>
+        <w:t xml:space="preserve">El entrenamiento genera </w:t>
+      </w:r>
+      <w:proofErr w:type="spellStart"/>
+      <w:r>
+        <w:t>models</w:t>
+      </w:r>
+      <w:proofErr w:type="spellEnd"/>
+      <w:r>
+        <w:t>/</w:t>
+      </w:r>
+      <w:proofErr w:type="spellStart"/>
+      <w:r>
+        <w:t>modelo_incidencia_diaria.pkl</w:t>
+      </w:r>
+      <w:proofErr w:type="spellEnd"/>
+      <w:r>
+        <w:t xml:space="preserve">, </w:t>
+      </w:r>
+      <w:proofErr w:type="spellStart"/>
+      <w:r>
+        <w:t>reports</w:t>
+      </w:r>
+      <w:proofErr w:type="spellEnd"/>
+      <w:r>
+        <w:t>/</w:t>
+      </w:r>
+      <w:proofErr w:type="spellStart"/>
+      <w:r>
+        <w:t>modelo_resultados.json</w:t>
+      </w:r>
+      <w:proofErr w:type="spellEnd"/>
+      <w:r>
+        <w:t xml:space="preserve"> y </w:t>
+      </w:r>
+      <w:proofErr w:type="spellStart"/>
+      <w:r>
+        <w:t>reports</w:t>
+      </w:r>
+      <w:proofErr w:type="spellEnd"/>
+      <w:r>
+        <w:t xml:space="preserve">/predicciones_prueba.csv, lo que permite auditar el desempeño y reutilizar el modelo. Entre sus limitaciones: el </w:t>
+      </w:r>
+      <w:proofErr w:type="spellStart"/>
+      <w:r>
+        <w:t>dataset</w:t>
+      </w:r>
+      <w:proofErr w:type="spellEnd"/>
+      <w:r>
+        <w:t xml:space="preserve"> cubre solo cinco meses; no incorpora variables externas como población, operativos policiales, denuncias, movilidad o contexto socioeconómico; no debe interpretarse como causalidad; y no debe utilizarse para decisiones automatizadas sobre personas o grupos. Su función principal es generar señales de priorización territorial.</w:t>
       </w:r>
     </w:p>
     <w:p>
@@ -11266,7 +12322,23 @@
         <w:jc w:val="both"/>
       </w:pPr>
       <w:r>
-        <w:t>Además del modelo predictivo, se implementó un componente prescriptivo mediante el script src/models/prescriptivo.py. Este módulo genera recomendaciones estratégicas por provincia a partir del total de homicidios, homicidios del último mes, variación mensual, porcentaje de arma de fuego, porcentaje de ocurrencia en lugar público y cantones afectados.</w:t>
+        <w:t xml:space="preserve">Además del modelo predictivo, se implementó un componente prescriptivo mediante el script </w:t>
+      </w:r>
+      <w:proofErr w:type="spellStart"/>
+      <w:r>
+        <w:t>src</w:t>
+      </w:r>
+      <w:proofErr w:type="spellEnd"/>
+      <w:r>
+        <w:t>/</w:t>
+      </w:r>
+      <w:proofErr w:type="spellStart"/>
+      <w:r>
+        <w:t>models</w:t>
+      </w:r>
+      <w:proofErr w:type="spellEnd"/>
+      <w:r>
+        <w:t>/prescriptivo.py. Este módulo genera recomendaciones estratégicas por provincia a partir del total de homicidios, homicidios del último mes, variación mensual, porcentaje de arma de fuego, porcentaje de ocurrencia en lugar público y cantones afectados.</w:t>
       </w:r>
     </w:p>
     <w:p>
@@ -11300,12 +12372,6 @@
         <w:gridCol w:w="3200"/>
       </w:tblGrid>
       <w:tr>
-        <w:tblPrEx>
-          <w:tblCellMar>
-            <w:top w:w="0" w:type="dxa"/>
-            <w:bottom w:w="0" w:type="dxa"/>
-          </w:tblCellMar>
-        </w:tblPrEx>
         <w:trPr>
           <w:tblHeader/>
         </w:trPr>
@@ -11365,12 +12431,6 @@
         </w:tc>
       </w:tr>
       <w:tr>
-        <w:tblPrEx>
-          <w:tblCellMar>
-            <w:top w:w="0" w:type="dxa"/>
-            <w:bottom w:w="0" w:type="dxa"/>
-          </w:tblCellMar>
-        </w:tblPrEx>
         <w:tc>
           <w:tcPr>
             <w:tcW w:w="5800" w:type="dxa"/>
@@ -11416,12 +12476,6 @@
         </w:tc>
       </w:tr>
       <w:tr>
-        <w:tblPrEx>
-          <w:tblCellMar>
-            <w:top w:w="0" w:type="dxa"/>
-            <w:bottom w:w="0" w:type="dxa"/>
-          </w:tblCellMar>
-        </w:tblPrEx>
         <w:tc>
           <w:tcPr>
             <w:tcW w:w="5800" w:type="dxa"/>
@@ -11469,12 +12523,6 @@
         </w:tc>
       </w:tr>
       <w:tr>
-        <w:tblPrEx>
-          <w:tblCellMar>
-            <w:top w:w="0" w:type="dxa"/>
-            <w:bottom w:w="0" w:type="dxa"/>
-          </w:tblCellMar>
-        </w:tblPrEx>
         <w:tc>
           <w:tcPr>
             <w:tcW w:w="5800" w:type="dxa"/>
@@ -11532,7 +12580,15 @@
         <w:jc w:val="both"/>
       </w:pPr>
       <w:r>
-        <w:t>Estas recomendaciones se integran en el dashboard para apoyar decisiones ejecutivas.</w:t>
+        <w:t xml:space="preserve">Estas recomendaciones se integran en el </w:t>
+      </w:r>
+      <w:proofErr w:type="spellStart"/>
+      <w:r>
+        <w:t>dashboard</w:t>
+      </w:r>
+      <w:proofErr w:type="spellEnd"/>
+      <w:r>
+        <w:t xml:space="preserve"> para apoyar decisiones ejecutivas.</w:t>
       </w:r>
     </w:p>
     <w:p>
@@ -11574,7 +12630,15 @@
         <w:jc w:val="both"/>
       </w:pPr>
       <w:r>
-        <w:t>El dataset contiene registros históricos de homicidios intencionales que pueden reflejar sesgos asociados a diferencias en la capacidad de registro entre territorios, subregistro de ciertos eventos, mayor presencia policial o institucional en determinadas zonas, diferencias poblacionales entre provincias, variables sensibles como sexo, género, etnia o nacionalidad, y concentración urbana de hechos.</w:t>
+        <w:t xml:space="preserve">El </w:t>
+      </w:r>
+      <w:proofErr w:type="spellStart"/>
+      <w:r>
+        <w:t>dataset</w:t>
+      </w:r>
+      <w:proofErr w:type="spellEnd"/>
+      <w:r>
+        <w:t xml:space="preserve"> contiene registros históricos de homicidios intencionales que pueden reflejar sesgos asociados a diferencias en la capacidad de registro entre territorios, subregistro de ciertos eventos, mayor presencia policial o institucional en determinadas zonas, diferencias poblacionales entre provincias, variables sensibles como sexo, género, etnia o nacionalidad, y concentración urbana de hechos.</w:t>
       </w:r>
     </w:p>
     <w:p>
@@ -11594,6 +12658,7 @@
       </w:pPr>
       <w:bookmarkStart w:id="64" w:name="_Toc234523538"/>
       <w:r>
+        <w:lastRenderedPageBreak/>
         <w:t>Riesgo de Discriminación</w:t>
       </w:r>
       <w:bookmarkEnd w:id="64"/>
@@ -11634,10 +12699,23 @@
         <w:jc w:val="both"/>
       </w:pPr>
       <w:r>
-        <w:t xml:space="preserve">La Regresión Lineal complementa la explicabilidad porque sus coeficientes indican, de forma cuantitativa, cuánto pesa cada variable en la predicción. Los coeficientes de mayor magnitud corresponden a las provincias con más incidencia; por ejemplo, la pertenencia a Guayas incrementa la estimación diaria en aproximadamente 8,3 homicidios respecto a la referencia, mientras que provincias de baja incidencia como Carchi o Morona Santiago presentan coeficientes negativos. Estos pesos son visibles en el dashboard </w:t>
-      </w:r>
-      <w:r>
-        <w:t>(pestaña Predictiva) y permiten al negocio confiar en el modelo al ver qué variables lo impulsan.</w:t>
+        <w:t xml:space="preserve">La Regresión Lineal complementa la </w:t>
+      </w:r>
+      <w:proofErr w:type="spellStart"/>
+      <w:r>
+        <w:t>explicabilidad</w:t>
+      </w:r>
+      <w:proofErr w:type="spellEnd"/>
+      <w:r>
+        <w:t xml:space="preserve"> porque sus coeficientes indican, de forma cuantitativa, cuánto pesa cada variable en la predicción. Los coeficientes de mayor magnitud corresponden a las provincias con más incidencia; por ejemplo, la pertenencia a Guayas incrementa la estimación diaria en aproximadamente 8,3 homicidios respecto a la referencia, mientras que provincias de baja incidencia como Carchi o Morona Santiago presentan coeficientes negativos. Estos pesos son visibles en el </w:t>
+      </w:r>
+      <w:proofErr w:type="spellStart"/>
+      <w:r>
+        <w:t>dashboard</w:t>
+      </w:r>
+      <w:proofErr w:type="spellEnd"/>
+      <w:r>
+        <w:t xml:space="preserve"> (pestaña Predictiva) y permiten al negocio confiar en el modelo al ver qué variables lo impulsan.</w:t>
       </w:r>
     </w:p>
     <w:p>
@@ -11646,7 +12724,15 @@
         <w:jc w:val="both"/>
       </w:pPr>
       <w:r>
-        <w:t>El índice de riesgo territorial también es explicable, ya que se construye con variables visibles en el dashboard: volumen histórico, casos recientes, variación mensual, arma de fuego y lugar público.</w:t>
+        <w:t xml:space="preserve">El índice de riesgo territorial también es explicable, ya que se construye con variables visibles en el </w:t>
+      </w:r>
+      <w:proofErr w:type="spellStart"/>
+      <w:r>
+        <w:t>dashboard</w:t>
+      </w:r>
+      <w:proofErr w:type="spellEnd"/>
+      <w:r>
+        <w:t>: volumen histórico, casos recientes, variación mensual, arma de fuego y lugar público.</w:t>
       </w:r>
     </w:p>
     <w:p>
@@ -11667,10 +12753,63 @@
         <w:jc w:val="both"/>
       </w:pPr>
       <w:r>
-        <w:t>Para mantener transparencia, el código del modelo está disponible en src/models/entrenar_modelo.py, las métricas se guardan en reports/modelo_resultados.json, las predicciones de prueba en reports/predicciones_prueba.csv, las recomendaciones en reports/recomendaciones_estrategicas.csv y el índice de riesgo en reports/riesgo_territorial.csv. La gobernanza del proyecto se apoya en la trazabilidad del Excel original, transformaciones documentadas en Python, un modelo estrella reproducible, un reporte de calida</w:t>
-      </w:r>
-      <w:r>
-        <w:t>d, la separación entre datos crudos, procesados, reportes y modelo, el uso de resultados agregados y la interpretación humana de las recomendaciones.</w:t>
+        <w:t xml:space="preserve">Para mantener transparencia, el código del modelo está disponible en </w:t>
+      </w:r>
+      <w:proofErr w:type="spellStart"/>
+      <w:r>
+        <w:t>src</w:t>
+      </w:r>
+      <w:proofErr w:type="spellEnd"/>
+      <w:r>
+        <w:t>/</w:t>
+      </w:r>
+      <w:proofErr w:type="spellStart"/>
+      <w:r>
+        <w:t>models</w:t>
+      </w:r>
+      <w:proofErr w:type="spellEnd"/>
+      <w:r>
+        <w:t xml:space="preserve">/entrenar_modelo.py, las métricas se guardan en </w:t>
+      </w:r>
+      <w:proofErr w:type="spellStart"/>
+      <w:r>
+        <w:t>reports</w:t>
+      </w:r>
+      <w:proofErr w:type="spellEnd"/>
+      <w:r>
+        <w:t>/</w:t>
+      </w:r>
+      <w:proofErr w:type="spellStart"/>
+      <w:r>
+        <w:t>modelo_resultados.json</w:t>
+      </w:r>
+      <w:proofErr w:type="spellEnd"/>
+      <w:r>
+        <w:t xml:space="preserve">, las predicciones de prueba en </w:t>
+      </w:r>
+      <w:proofErr w:type="spellStart"/>
+      <w:r>
+        <w:t>reports</w:t>
+      </w:r>
+      <w:proofErr w:type="spellEnd"/>
+      <w:r>
+        <w:t xml:space="preserve">/predicciones_prueba.csv, las recomendaciones en </w:t>
+      </w:r>
+      <w:proofErr w:type="spellStart"/>
+      <w:r>
+        <w:t>reports</w:t>
+      </w:r>
+      <w:proofErr w:type="spellEnd"/>
+      <w:r>
+        <w:t xml:space="preserve">/recomendaciones_estrategicas.csv y el índice de riesgo en </w:t>
+      </w:r>
+      <w:proofErr w:type="spellStart"/>
+      <w:r>
+        <w:t>reports</w:t>
+      </w:r>
+      <w:proofErr w:type="spellEnd"/>
+      <w:r>
+        <w:t>/riesgo_territorial.csv. La gobernanza del proyecto se apoya en la trazabilidad del Excel original, transformaciones documentadas en Python, un modelo estrella reproducible, un reporte de calidad, la separación entre datos crudos, procesados, reportes y modelo, el uso de resultados agregados y la interpretación humana de las recomendaciones.</w:t>
       </w:r>
     </w:p>
     <w:p>
@@ -11787,7 +12926,19 @@
         <w:jc w:val="both"/>
       </w:pPr>
       <w:r>
-        <w:t>La Fase 4 incorpora un modelo predictivo exploratorio y un componente prescriptivo para priorización territorial. El enfoque utilizado privilegia la explicabilidad, la trazabilidad y la gobernanza responsable. El sistema permite generar señales útiles para la toma de decisiones, siempre bajo la premisa de que los resultados deben complementar, no reemplazar, el criterio técnico de las autoridades.</w:t>
+        <w:t xml:space="preserve">La Fase 4 incorpora un modelo predictivo exploratorio y un componente prescriptivo para priorización territorial. El enfoque utilizado privilegia la </w:t>
+      </w:r>
+      <w:proofErr w:type="spellStart"/>
+      <w:r>
+        <w:t>explicabilidad</w:t>
+      </w:r>
+      <w:proofErr w:type="spellEnd"/>
+      <w:r>
+        <w:t xml:space="preserve">, la trazabilidad y la gobernanza responsable. El sistema permite generar señales útiles para la toma de decisiones, siempre </w:t>
+      </w:r>
+      <w:r>
+        <w:lastRenderedPageBreak/>
+        <w:t>bajo la premisa de que los resultados deben complementar, no reemplazar, el criterio técnico de las autoridades.</w:t>
       </w:r>
     </w:p>
     <w:sectPr>
@@ -11824,60 +12975,8 @@
 <w:ftr xmlns:wpc="http://schemas.microsoft.com/office/word/2010/wordprocessingCanvas" xmlns:cx="http://schemas.microsoft.com/office/drawing/2014/chartex" xmlns:cx1="http://schemas.microsoft.com/office/drawing/2015/9/8/chartex" xmlns:cx2="http://schemas.microsoft.com/office/drawing/2015/10/21/chartex" xmlns:cx3="http://schemas.microsoft.com/office/drawing/2016/5/9/chartex" xmlns:cx4="http://schemas.microsoft.com/office/drawing/2016/5/10/chartex" xmlns:cx5="http://schemas.microsoft.com/office/drawing/2016/5/11/chartex" xmlns:cx6="http://schemas.microsoft.com/office/drawing/2016/5/12/chartex" xmlns:cx7="http://schemas.microsoft.com/office/drawing/2016/5/13/chartex" xmlns:cx8="http://schemas.microsoft.com/office/drawing/2016/5/14/chartex" xmlns:mc="http://schemas.openxmlformats.org/markup-compatibility/2006" xmlns:aink="http://schemas.microsoft.com/office/drawing/2016/ink" xmlns:am3d="http://schemas.microsoft.com/office/drawing/2017/model3d" xmlns:o="urn:schemas-microsoft-com:office:office" xmlns:oel="http://schemas.microsoft.com/office/2019/extlst" xmlns:r="http://schemas.openxmlformats.org/officeDocument/2006/relationships" xmlns:m="http://schemas.openxmlformats.org/officeDocument/2006/math" xmlns:v="urn:schemas-microsoft-com:vml" xmlns:wp14="http://schemas.microsoft.com/office/word/2010/wordprocessingDrawing" xmlns:wp="http://schemas.openxmlformats.org/drawingml/2006/wordprocessingDrawing" xmlns:w10="urn:schemas-microsoft-com:office:word" xmlns:w="http://schemas.openxmlformats.org/wordprocessingml/2006/main" xmlns:w14="http://schemas.microsoft.com/office/word/2010/wordml" xmlns:w15="http://schemas.microsoft.com/office/word/2012/wordml" xmlns:w16cex="http://schemas.microsoft.com/office/word/2018/wordml/cex" xmlns:w16cid="http://schemas.microsoft.com/office/word/2016/wordml/cid" xmlns:w16="http://schemas.microsoft.com/office/word/2018/wordml" xmlns:w16du="http://schemas.microsoft.com/office/word/2023/wordml/word16du" xmlns:w16sdtdh="http://schemas.microsoft.com/office/word/2020/wordml/sdtdatahash" xmlns:w16sdtfl="http://schemas.microsoft.com/office/word/2024/wordml/sdtformatlock" xmlns:w16se="http://schemas.microsoft.com/office/word/2015/wordml/symex" xmlns:wpg="http://schemas.microsoft.com/office/word/2010/wordprocessingGroup" xmlns:wpi="http://schemas.microsoft.com/office/word/2010/wordprocessingInk" xmlns:wne="http://schemas.microsoft.com/office/word/2006/wordml" xmlns:wps="http://schemas.microsoft.com/office/word/2010/wordprocessingShape" mc:Ignorable="w14 w15 w16se w16cid w16 w16cex w16sdtdh w16sdtfl w16du wp14">
   <w:p>
     <w:pPr>
-      <w:pBdr>
-        <w:top w:val="single" w:sz="4" w:space="4" w:color="BFBFBF"/>
-      </w:pBdr>
-      <w:jc w:val="center"/>
+      <w:pStyle w:val="Piedepgina"/>
     </w:pPr>
-    <w:r>
-      <w:rPr>
-        <w:color w:val="808080"/>
-        <w:sz w:val="16"/>
-        <w:szCs w:val="16"/>
-      </w:rPr>
-      <w:t xml:space="preserve">SafeAnalytics EC  |  Proyecto Integrador – Analítica de Negocios 7A          </w:t>
-    </w:r>
-    <w:r>
-      <w:rPr>
-        <w:color w:val="808080"/>
-        <w:sz w:val="16"/>
-        <w:szCs w:val="16"/>
-      </w:rPr>
-      <w:fldChar w:fldCharType="begin"/>
-    </w:r>
-    <w:r>
-      <w:rPr>
-        <w:color w:val="808080"/>
-        <w:sz w:val="16"/>
-        <w:szCs w:val="16"/>
-      </w:rPr>
-      <w:instrText>PAGE</w:instrText>
-    </w:r>
-    <w:r>
-      <w:rPr>
-        <w:color w:val="808080"/>
-        <w:sz w:val="16"/>
-        <w:szCs w:val="16"/>
-      </w:rPr>
-      <w:fldChar w:fldCharType="separate"/>
-    </w:r>
-    <w:r>
-      <w:rPr>
-        <w:noProof/>
-        <w:color w:val="808080"/>
-        <w:sz w:val="16"/>
-        <w:szCs w:val="16"/>
-      </w:rPr>
-      <w:t>4</w:t>
-    </w:r>
-    <w:r>
-      <w:rPr>
-        <w:color w:val="808080"/>
-        <w:sz w:val="16"/>
-        <w:szCs w:val="16"/>
-      </w:rPr>
-      <w:fldChar w:fldCharType="end"/>
-    </w:r>
   </w:p>
 </w:ftr>
 </file>
@@ -12639,6 +13738,48 @@
       <w:ind w:left="480"/>
     </w:pPr>
   </w:style>
+  <w:style w:type="paragraph" w:styleId="Encabezado">
+    <w:name w:val="header"/>
+    <w:basedOn w:val="Normal"/>
+    <w:link w:val="EncabezadoCar"/>
+    <w:uiPriority w:val="99"/>
+    <w:unhideWhenUsed/>
+    <w:rsid w:val="004A589B"/>
+    <w:pPr>
+      <w:tabs>
+        <w:tab w:val="center" w:pos="4419"/>
+        <w:tab w:val="right" w:pos="8838"/>
+      </w:tabs>
+    </w:pPr>
+  </w:style>
+  <w:style w:type="character" w:customStyle="1" w:styleId="EncabezadoCar">
+    <w:name w:val="Encabezado Car"/>
+    <w:basedOn w:val="Fuentedeprrafopredeter"/>
+    <w:link w:val="Encabezado"/>
+    <w:uiPriority w:val="99"/>
+    <w:rsid w:val="004A589B"/>
+  </w:style>
+  <w:style w:type="paragraph" w:styleId="Piedepgina">
+    <w:name w:val="footer"/>
+    <w:basedOn w:val="Normal"/>
+    <w:link w:val="PiedepginaCar"/>
+    <w:uiPriority w:val="99"/>
+    <w:unhideWhenUsed/>
+    <w:rsid w:val="004A589B"/>
+    <w:pPr>
+      <w:tabs>
+        <w:tab w:val="center" w:pos="4419"/>
+        <w:tab w:val="right" w:pos="8838"/>
+      </w:tabs>
+    </w:pPr>
+  </w:style>
+  <w:style w:type="character" w:customStyle="1" w:styleId="PiedepginaCar">
+    <w:name w:val="Pie de página Car"/>
+    <w:basedOn w:val="Fuentedeprrafopredeter"/>
+    <w:link w:val="Piedepgina"/>
+    <w:uiPriority w:val="99"/>
+    <w:rsid w:val="004A589B"/>
+  </w:style>
 </w:styles>
 </file>
 

</xml_diff>